<commit_message>
Chat can do everything; spending tabs, term planning, goals merged into plans
- Assistant: do_action proposals (confirm card, runs only on owner Confirm) and
  read_records cover bills, subscriptions, balances, terms, scholarships, email,
  routes, limits and more; payments stay human-only
- Spending: Entries | Fixed costs tabs; bills, recurring costs and subscriptions
  in one list with a chart and the payment-habits indicator
- Student money renamed Term planning, with income/expense/buffer entries
- Goals become exchange plans with recipient, category and linked progress;
  existing goals migrate automatically
- Banks: AI reads public rate/fee pages, falls back to AI knowledge; exchange
  scenarios (which bank converts, once or split)
- Sandbox dated timeline; email settings moved into Settings
</commit_message>
<xml_diff>
--- a/AI Cross-Border Remittance Assistant.docx
+++ b/AI Cross-Border Remittance Assistant.docx
@@ -3,2247 +3,1339 @@
 <w:document xmlns:wpc="http://schemas.microsoft.com/office/word/2010/wordprocessingCanvas" xmlns:cx="http://schemas.microsoft.com/office/drawing/2014/chartex" xmlns:cx1="http://schemas.microsoft.com/office/drawing/2015/9/8/chartex" xmlns:cx2="http://schemas.microsoft.com/office/drawing/2015/10/21/chartex" xmlns:cx3="http://schemas.microsoft.com/office/drawing/2016/5/9/chartex" xmlns:cx4="http://schemas.microsoft.com/office/drawing/2016/5/10/chartex" xmlns:cx5="http://schemas.microsoft.com/office/drawing/2016/5/11/chartex" xmlns:cx6="http://schemas.microsoft.com/office/drawing/2016/5/12/chartex" xmlns:cx7="http://schemas.microsoft.com/office/drawing/2016/5/13/chartex" xmlns:cx8="http://schemas.microsoft.com/office/drawing/2016/5/14/chartex" xmlns:mc="http://schemas.openxmlformats.org/markup-compatibility/2006" xmlns:aink="http://schemas.microsoft.com/office/drawing/2016/ink" xmlns:am3d="http://schemas.microsoft.com/office/drawing/2017/model3d" xmlns:o="urn:schemas-microsoft-com:office:office" xmlns:oel="http://schemas.microsoft.com/office/2019/extlst" xmlns:r="http://schemas.openxmlformats.org/officeDocument/2006/relationships" xmlns:m="http://schemas.openxmlformats.org/officeDocument/2006/math" xmlns:v="urn:schemas-microsoft-com:vml" xmlns:wp14="http://schemas.microsoft.com/office/word/2010/wordprocessingDrawing" xmlns:wp="http://schemas.openxmlformats.org/drawingml/2006/wordprocessingDrawing" xmlns:w10="urn:schemas-microsoft-com:office:word" xmlns:w="http://schemas.openxmlformats.org/wordprocessingml/2006/main" xmlns:w14="http://schemas.microsoft.com/office/word/2010/wordml" xmlns:w15="http://schemas.microsoft.com/office/word/2012/wordml" xmlns:w16cex="http://schemas.microsoft.com/office/word/2018/wordml/cex" xmlns:w16cid="http://schemas.microsoft.com/office/word/2016/wordml/cid" xmlns:w16="http://schemas.microsoft.com/office/word/2018/wordml" xmlns:w16du="http://schemas.microsoft.com/office/word/2023/wordml/word16du" xmlns:w16sdtdh="http://schemas.microsoft.com/office/word/2020/wordml/sdtdatahash" xmlns:w16sdtfl="http://schemas.microsoft.com/office/word/2024/wordml/sdtformatlock" xmlns:w16se="http://schemas.microsoft.com/office/word/2015/wordml/symex" xmlns:wpg="http://schemas.microsoft.com/office/word/2010/wordprocessingGroup" xmlns:wpi="http://schemas.microsoft.com/office/word/2010/wordprocessingInk" xmlns:wne="http://schemas.microsoft.com/office/word/2006/wordml" xmlns:wps="http://schemas.microsoft.com/office/word/2010/wordprocessingShape" mc:Ignorable="w14 w15 w16se w16cid w16 w16cex w16sdtdh w16sdtfl w16du wp14">
   <w:body>
     <w:p>
-      <w:r>
-        <w:rPr>
-          <w:b/>
-          <w:bCs/>
-        </w:rPr>
-        <w:t>AI Cross-Border Remittance Assistant</w:t>
-      </w:r>
-      <w:r>
-        <w:t> </w:t>
-      </w:r>
-    </w:p>
-    <w:p>
-      <w:r>
-        <w:rPr>
-          <w:b/>
-          <w:bCs/>
-        </w:rPr>
-        <w:t>Functional Module Specification</w:t>
-      </w:r>
-      <w:r>
-        <w:t> </w:t>
-      </w:r>
-    </w:p>
-    <w:p>
-      <w:r>
-        <w:t>A Multi-Currency, Exchange Rate Analysis, and Permission-Controlled Payment Assistant for Anyone with Cross-Border Transfer Needs </w:t>
-      </w:r>
-    </w:p>
-    <w:p>
-      <w:r>
-        <w:rPr>
-          <w:b/>
-          <w:bCs/>
-        </w:rPr>
-        <w:t>Product Proposal Version 4.0 — October 17, 2026</w:t>
-      </w:r>
-      <w:r>
-        <w:t> </w:t>
-      </w:r>
-    </w:p>
-    <w:p>
-      <w:r>
-        <w:t>This document describes the product background, user needs, functional modules, and delivery priorities. The product serves users regardless of nationality, birthplace, language, student status, or location. </w:t>
-      </w:r>
-    </w:p>
-    <w:p>
-      <w:r>
-        <w:t>The first release prioritizes a complete, working sandbox transfer flow supported by permission tiers, transaction guardrails, multi-currency balances, and an audit log. Exchange rate analysis supports this core workflow. Advanced forecasting, extensive reporting, and broader regional coverage are secondary. </w:t>
-      </w:r>
-    </w:p>
-    <w:p>
-      <w:r>
-        <w:rPr>
-          <w:b/>
-          <w:bCs/>
-        </w:rPr>
-        <w:t>1 Product Background and Positioning</w:t>
-      </w:r>
-      <w:r>
-        <w:t> </w:t>
-      </w:r>
-    </w:p>
-    <w:p>
-      <w:r>
-        <w:t>People making cross-border transfers must consider exchange rates, fees, available funds, recipient details, and delivery times. The amount calculated using a reference rate may differ from the amount received after charges. A low advertised fee does not necessarily produce the highest receiving amount. </w:t>
-      </w:r>
-    </w:p>
-    <w:p>
-      <w:r>
-        <w:t>Potential users include people supporting family overseas, people living or working abroad, international students, freelancers receiving overseas income, and individuals with business-related cross-border payment needs. </w:t>
-      </w:r>
-    </w:p>
-    <w:p>
-      <w:r>
-        <w:t>The product is a natural-language AI Agent that helps users understand exchange rates, compare transfer options, prepare payment instructions, and complete an explicitly authorized sandbox transaction. </w:t>
-      </w:r>
-    </w:p>
-    <w:p>
-      <w:r>
-        <w:t>The Agent can retrieve information and prepare actions, but permissions and transaction rules are enforced by the application. The model cannot grant itself additional access, approve its own payment, or bypass user confirmation. </w:t>
-      </w:r>
-    </w:p>
-    <w:p>
-      <w:r>
-        <w:t>The first release uses a provider-supported sandbox with test funds. It does not move real money. Accepting a financial recommendation and authorizing a sandbox payment are separate actions. </w:t>
-      </w:r>
-    </w:p>
-    <w:p>
-      <w:r>
-        <w:rPr>
-          <w:b/>
-          <w:bCs/>
-        </w:rPr>
-        <w:t>2 Market Needs and User Problems</w:t>
-      </w:r>
-      <w:r>
-        <w:t> </w:t>
-      </w:r>
-    </w:p>
-    <w:p>
-      <w:r>
-        <w:rPr>
-          <w:b/>
-          <w:bCs/>
-        </w:rPr>
-        <w:t>2.1 Understanding Total Transfer Costs</w:t>
-      </w:r>
-      <w:r>
-        <w:t> </w:t>
-      </w:r>
-    </w:p>
-    <w:p>
-      <w:r>
-        <w:lastRenderedPageBreak/>
-        <w:t>Users need to know how much will arrive from a specified sending amount and how much they must prepare to achieve a target receiving amount. </w:t>
-      </w:r>
-    </w:p>
-    <w:p>
-      <w:r>
-        <w:t>Reference rates, provider rates, fixed fees, percentage fees, spreads, and other known charges should be clearly distinguished. </w:t>
-      </w:r>
-    </w:p>
-    <w:p>
-      <w:r>
-        <w:rPr>
-          <w:b/>
-          <w:bCs/>
-        </w:rPr>
-        <w:t>2.2 Assessing Exchange Rate Levels</w:t>
-      </w:r>
-      <w:r>
-        <w:t> </w:t>
-      </w:r>
-    </w:p>
-    <w:p>
-      <w:r>
-        <w:t>Users want to understand whether the current rate is relatively favorable compared with the past 30 days, 90 days, or year. </w:t>
-      </w:r>
-    </w:p>
-    <w:p>
-      <w:r>
-        <w:t>Historical levels must be interpreted according to the conversion direction. A rate favorable for one direction may be unfavorable for the reverse transaction. </w:t>
-      </w:r>
-    </w:p>
-    <w:p>
-      <w:r>
-        <w:rPr>
-          <w:b/>
-          <w:bCs/>
-        </w:rPr>
-        <w:t>2.3 Meeting Payment Deadlines</w:t>
-      </w:r>
-      <w:r>
-        <w:t> </w:t>
-      </w:r>
-    </w:p>
-    <w:p>
-      <w:r>
-        <w:t>Family support, tuition, rent, and business payments may have fixed deadlines. Users need to consider funding availability and delivery estimates alongside possible exchange rate changes. </w:t>
-      </w:r>
-    </w:p>
-    <w:p>
-      <w:r>
-        <w:rPr>
-          <w:b/>
-          <w:bCs/>
-        </w:rPr>
-        <w:t>2.4 Controlling What an AI Agent Can Do</w:t>
-      </w:r>
-      <w:r>
-        <w:t> </w:t>
-      </w:r>
-    </w:p>
-    <w:p>
-      <w:r>
-        <w:t>Users need a clear distinction between allowing an assistant to view information, prepare a payment, and submit a transaction. </w:t>
-      </w:r>
-    </w:p>
-    <w:p>
-      <w:r>
-        <w:t>They also need visibility into what was requested, what was authorized, which checks were performed, and what happened afterward. </w:t>
-      </w:r>
-    </w:p>
-    <w:p>
-      <w:r>
-        <w:rPr>
-          <w:b/>
-          <w:bCs/>
-        </w:rPr>
-        <w:t>2.5 Managing Funds Across Currencies</w:t>
-      </w:r>
-      <w:r>
-        <w:t> </w:t>
-      </w:r>
-    </w:p>
-    <w:p>
-      <w:r>
-        <w:t>Users may hold multiple currencies and need to distinguish total balances, available funds, and amounts reserved for pending payments. </w:t>
-      </w:r>
-    </w:p>
-    <w:p>
-      <w:r>
-        <w:t>A converted total is useful for reference, but it must not be confused with funds immediately available for spending. </w:t>
-      </w:r>
-    </w:p>
-    <w:p>
-      <w:r>
-        <w:rPr>
-          <w:b/>
-          <w:bCs/>
-        </w:rPr>
-        <w:t>2.6 Building Consistent Payment Habits</w:t>
-      </w:r>
-      <w:r>
-        <w:t> </w:t>
-      </w:r>
-    </w:p>
-    <w:p>
-      <w:r>
-        <w:t>Some users want support with payment deadlines, reliable recordkeeping, and understanding how financial habits may relate to credit. </w:t>
-      </w:r>
-    </w:p>
-    <w:p>
-      <w:r>
-        <w:t>The product can provide educational support and payment-history tracking without presenting its own indicators as official credit scores. </w:t>
-      </w:r>
-    </w:p>
-    <w:p>
-      <w:r>
-        <w:lastRenderedPageBreak/>
-        <w:t>These needs are product hypotheses. Continued usage, willingness to pay, preferred routes, and the value of individual features require validation through interviews and prototype testing. </w:t>
-      </w:r>
-    </w:p>
-    <w:p>
-      <w:r>
-        <w:rPr>
-          <w:b/>
-          <w:bCs/>
-        </w:rPr>
-        <w:t>3 Core Problems the Product Can Address</w:t>
-      </w:r>
-      <w:r>
-        <w:t> </w:t>
-      </w:r>
-    </w:p>
-    <w:p>
-      <w:pPr>
-        <w:numPr>
-          <w:ilvl w:val="0"/>
-          <w:numId w:val="1"/>
-        </w:numPr>
-      </w:pPr>
-      <w:r>
-        <w:t>Retrieve current reference rates with identifiable sources and timestamps. </w:t>
-      </w:r>
-    </w:p>
-    <w:p>
-      <w:pPr>
-        <w:numPr>
-          <w:ilvl w:val="0"/>
-          <w:numId w:val="2"/>
-        </w:numPr>
-      </w:pPr>
-      <w:r>
-        <w:t>Explain historical exchange rate levels and their relevance to the selected conversion direction. </w:t>
-      </w:r>
-    </w:p>
-    <w:p>
-      <w:pPr>
-        <w:numPr>
-          <w:ilvl w:val="0"/>
-          <w:numId w:val="3"/>
-        </w:numPr>
-      </w:pPr>
-      <w:r>
-        <w:t>Compare transfer costs, net receiving amounts, and delivery estimates. </w:t>
-      </w:r>
-    </w:p>
-    <w:p>
-      <w:pPr>
-        <w:numPr>
-          <w:ilvl w:val="0"/>
-          <w:numId w:val="4"/>
-        </w:numPr>
-      </w:pPr>
-      <w:r>
-        <w:t>Check balances, permissions, limits, and payment details before submission. </w:t>
-      </w:r>
-    </w:p>
-    <w:p>
-      <w:pPr>
-        <w:numPr>
-          <w:ilvl w:val="0"/>
-          <w:numId w:val="5"/>
-        </w:numPr>
-      </w:pPr>
-      <w:r>
-        <w:t>Complete one explicitly authorized sandbox transfer from preparation to final status. </w:t>
-      </w:r>
-    </w:p>
-    <w:p>
-      <w:pPr>
-        <w:numPr>
-          <w:ilvl w:val="0"/>
-          <w:numId w:val="6"/>
-        </w:numPr>
-      </w:pPr>
-      <w:r>
-        <w:t>Maintain separate multi-currency balances and pending-payment reservations. </w:t>
-      </w:r>
-    </w:p>
-    <w:p>
-      <w:pPr>
-        <w:numPr>
-          <w:ilvl w:val="0"/>
-          <w:numId w:val="7"/>
-        </w:numPr>
-      </w:pPr>
-      <w:r>
-        <w:t>Record user decisions, tool actions, guardrail outcomes, and transaction events. </w:t>
-      </w:r>
-    </w:p>
-    <w:p>
-      <w:pPr>
-        <w:numPr>
-          <w:ilvl w:val="0"/>
-          <w:numId w:val="8"/>
-        </w:numPr>
-      </w:pPr>
-      <w:r>
-        <w:t>Support payment reminders, basic financial habits, and credit education. </w:t>
-      </w:r>
-    </w:p>
-    <w:p>
-      <w:pPr>
-        <w:numPr>
-          <w:ilvl w:val="0"/>
-          <w:numId w:val="9"/>
-        </w:numPr>
-      </w:pPr>
-      <w:r>
-        <w:t>Provide forecasts and scenario analysis where sufficient data and evaluation are available. </w:t>
-      </w:r>
-    </w:p>
-    <w:p>
-      <w:r>
-        <w:rPr>
-          <w:b/>
-          <w:bCs/>
-        </w:rPr>
-        <w:t>4 Functional Modules and Capabilities</w:t>
-      </w:r>
-      <w:r>
-        <w:t> </w:t>
-      </w:r>
-    </w:p>
-    <w:p>
-      <w:r>
-        <w:rPr>
-          <w:b/>
-          <w:bCs/>
-        </w:rPr>
-        <w:t>4.1 User Funds and Transfer Requirements Module</w:t>
-      </w:r>
-      <w:r>
-        <w:t> </w:t>
-      </w:r>
-    </w:p>
-    <w:p>
-      <w:r>
-        <w:t>Users specify their existing currencies and funds, sending and receiving locations, target currency, language, payment purpose, and desired arrival date. </w:t>
-      </w:r>
-    </w:p>
-    <w:p>
-      <w:r>
-        <w:t>For example: </w:t>
-      </w:r>
-    </w:p>
-    <w:p>
-      <w:r>
-        <w:t>“I want to send Australian dollars to my family overseas. Show me the total cost and prepare a sandbox transfer.” </w:t>
-      </w:r>
-    </w:p>
-    <w:p>
-      <w:r>
-        <w:t>The Agent confirms currencies, amounts, dates, and the intended recipient. Missing or ambiguous information must be clarified before payment preparation. </w:t>
-      </w:r>
-    </w:p>
-    <w:p>
-      <w:r>
-        <w:t>Users can work with a fixed sending amount or, where supported by the provider’s fee model, a target receiving amount. </w:t>
-      </w:r>
-    </w:p>
-    <w:p>
-      <w:r>
-        <w:t>Regional settings and nationality remain independent. The product does not infer transfer eligibility from a user’s name or language. </w:t>
-      </w:r>
-    </w:p>
-    <w:p>
-      <w:r>
-        <w:rPr>
-          <w:b/>
-          <w:bCs/>
-        </w:rPr>
-        <w:lastRenderedPageBreak/>
-        <w:t>4.2 Regional and APEC Route Management Module</w:t>
-      </w:r>
-      <w:r>
-        <w:t> </w:t>
-      </w:r>
-    </w:p>
-    <w:p>
-      <w:r>
-        <w:t>Users independently select sending and receiving economies or regions. The module loads relevant currencies, languages, time zones, and supported routes. </w:t>
-      </w:r>
-    </w:p>
-    <w:p>
-      <w:r>
-        <w:t>The product prioritizes demonstrable routes between APEC economies while allowing future expansion. </w:t>
-      </w:r>
-    </w:p>
-    <w:p>
-      <w:r>
-        <w:t>Administrators can add, update, enable, or disable regional configurations. Each route identifies its actual capabilities, such as: </w:t>
-      </w:r>
-    </w:p>
-    <w:p>
-      <w:pPr>
-        <w:numPr>
-          <w:ilvl w:val="0"/>
-          <w:numId w:val="10"/>
-        </w:numPr>
-      </w:pPr>
-      <w:r>
-        <w:t>Reference-rate queries. </w:t>
-      </w:r>
-    </w:p>
-    <w:p>
-      <w:pPr>
-        <w:numPr>
-          <w:ilvl w:val="0"/>
-          <w:numId w:val="11"/>
-        </w:numPr>
-      </w:pPr>
-      <w:r>
-        <w:t>Historical analysis. </w:t>
-      </w:r>
-    </w:p>
-    <w:p>
-      <w:pPr>
-        <w:numPr>
-          <w:ilvl w:val="0"/>
-          <w:numId w:val="12"/>
-        </w:numPr>
-      </w:pPr>
-      <w:r>
-        <w:t>Simulated comparisons. </w:t>
-      </w:r>
-    </w:p>
-    <w:p>
-      <w:pPr>
-        <w:numPr>
-          <w:ilvl w:val="0"/>
-          <w:numId w:val="13"/>
-        </w:numPr>
-      </w:pPr>
-      <w:r>
-        <w:t>Provider-supported sandbox transactions. </w:t>
-      </w:r>
-    </w:p>
-    <w:p>
-      <w:r>
-        <w:t>Enabling a regional template does not automatically enable payments. Provider support for the route, currency, recipient type, and payment purpose must be verified separately. </w:t>
-      </w:r>
-    </w:p>
-    <w:p>
-      <w:r>
-        <w:t>The first working payment flow should use a route confirmed to be available in the selected provider’s sandbox. </w:t>
-      </w:r>
-    </w:p>
-    <w:p>
-      <w:r>
-        <w:rPr>
-          <w:b/>
-          <w:bCs/>
-        </w:rPr>
-        <w:t>4.3 Latest Actual Exchange Rate Module</w:t>
-      </w:r>
-      <w:r>
-        <w:t> </w:t>
-      </w:r>
-    </w:p>
-    <w:p>
-      <w:r>
-        <w:t>Users can retrieve the latest available reference rate and view its source, quotation direction, observation time, update frequency, and recent change. </w:t>
-      </w:r>
-    </w:p>
-    <w:p>
-      <w:r>
-        <w:t>Daily data must be labeled as daily reference data. Delayed or intraday data must show the appropriate timestamp. </w:t>
-      </w:r>
-    </w:p>
-    <w:p>
-      <w:r>
-        <w:t>Reference rates, simulated rates, and provider quotes remain distinct. A reference rate is not necessarily the rate used for a payment. </w:t>
-      </w:r>
-    </w:p>
-    <w:p>
-      <w:r>
-        <w:t>If a source does not support a currency pair, the module reports that limitation. It must not substitute invented values and present them as actual data. </w:t>
-      </w:r>
-    </w:p>
-    <w:p>
-      <w:r>
-        <w:t>Cross rates calculated through a common base currency should be labeled as derived reference values. </w:t>
-      </w:r>
-    </w:p>
-    <w:p>
-      <w:r>
-        <w:rPr>
-          <w:b/>
-          <w:bCs/>
-        </w:rPr>
-        <w:t>4.4 Historical Exchange Rate Analysis Module</w:t>
-      </w:r>
-      <w:r>
-        <w:t> </w:t>
-      </w:r>
-    </w:p>
-    <w:p>
-      <w:r>
-        <w:t>Users select a historical window and view trends, minimums, maximums, averages, and percentile rankings. </w:t>
-      </w:r>
-    </w:p>
-    <w:p>
-      <w:r>
-        <w:lastRenderedPageBreak/>
-        <w:t>The module can identify a new high or low within that window, proximity to an extreme, or a relatively low, middle, or high position. </w:t>
-      </w:r>
-    </w:p>
-    <w:p>
-      <w:r>
-        <w:t>Every conclusion specifies the observation period and data coverage. A historical percentile is not a forecast probability or evidence that a currency is overvalued or undervalued. </w:t>
-      </w:r>
-    </w:p>
-    <w:p>
-      <w:r>
-        <w:t>The explanation must connect the result to the user’s conversion direction. </w:t>
-      </w:r>
-    </w:p>
-    <w:p>
-      <w:r>
-        <w:t>This module supports decisions but does not block payment completion if historical data is unavailable. </w:t>
-      </w:r>
-    </w:p>
-    <w:p>
-      <w:r>
-        <w:rPr>
-          <w:b/>
-          <w:bCs/>
-        </w:rPr>
-        <w:t>4.5 Future Forecasting and Scenario Analysis Module</w:t>
-      </w:r>
-      <w:r>
-        <w:t> </w:t>
-      </w:r>
-    </w:p>
-    <w:p>
-      <w:r>
-        <w:t>The product can provide experimental forecasts for defined horizons, initially seven days and later thirty days. </w:t>
-      </w:r>
-    </w:p>
-    <w:p>
-      <w:r>
-        <w:t>Forecasts display their generation time, data cutoff, horizon, historical testing errors, and evaluated prediction intervals where available. They should be compared with a simple unchanged-rate baseline. </w:t>
-      </w:r>
-    </w:p>
-    <w:p>
-      <w:r>
-        <w:t>If reliable evaluation or sufficient data is unavailable, the forecast remains unavailable rather than being invented by the language model. </w:t>
-      </w:r>
-    </w:p>
-    <w:p>
-      <w:r>
-        <w:t>Scenario analysis is separate. Users can ask: </w:t>
-      </w:r>
-    </w:p>
-    <w:p>
-      <w:r>
-        <w:t>“If the rate becomes 3% less favorable, how much more would I need?” </w:t>
-      </w:r>
-    </w:p>
-    <w:p>
-      <w:r>
-        <w:t>The module calculates the effect on required funds, receiving amounts, and funding shortfalls under explicit assumptions. </w:t>
-      </w:r>
-    </w:p>
-    <w:p>
-      <w:r>
-        <w:t>Forecasting is a secondary feature. A working sandbox payment flow takes priority over sophisticated predictions. </w:t>
-      </w:r>
-    </w:p>
-    <w:p>
-      <w:r>
-        <w:rPr>
-          <w:b/>
-          <w:bCs/>
-        </w:rPr>
-        <w:t>4.6 Cross-Border Transfer Comparison Module</w:t>
-      </w:r>
-      <w:r>
-        <w:t> </w:t>
-      </w:r>
-    </w:p>
-    <w:p>
-      <w:r>
-        <w:t>The module compares fixed fees, percentage fees, applied rates, known spreads, net receiving amounts, and estimated delivery times. </w:t>
-      </w:r>
-    </w:p>
-    <w:p>
-      <w:r>
-        <w:t>Users can rank options by receiving amount or speed and see the basis of the ranking. </w:t>
-      </w:r>
-    </w:p>
-    <w:p>
-      <w:r>
-        <w:t>The interface distinguishes: </w:t>
-      </w:r>
-    </w:p>
-    <w:p>
-      <w:pPr>
-        <w:numPr>
-          <w:ilvl w:val="0"/>
-          <w:numId w:val="14"/>
-        </w:numPr>
-      </w:pPr>
-      <w:r>
-        <w:t>Reference-rate calculations. </w:t>
-      </w:r>
-    </w:p>
-    <w:p>
-      <w:pPr>
-        <w:numPr>
-          <w:ilvl w:val="0"/>
-          <w:numId w:val="15"/>
-        </w:numPr>
-      </w:pPr>
-      <w:r>
-        <w:t>Simulated transfer options. </w:t>
-      </w:r>
-    </w:p>
-    <w:p>
-      <w:pPr>
-        <w:numPr>
-          <w:ilvl w:val="0"/>
-          <w:numId w:val="16"/>
-        </w:numPr>
-      </w:pPr>
-      <w:r>
-        <w:lastRenderedPageBreak/>
-        <w:t>Provider-issued sandbox quotes. </w:t>
-      </w:r>
-    </w:p>
-    <w:p>
-      <w:pPr>
-        <w:numPr>
-          <w:ilvl w:val="0"/>
-          <w:numId w:val="17"/>
-        </w:numPr>
-      </w:pPr>
-      <w:r>
-        <w:t>Live executable quotes, if added in a later release. </w:t>
-      </w:r>
-    </w:p>
-    <w:p>
-      <w:r>
-        <w:t>A sandbox quote does not represent a live payment offer. </w:t>
-      </w:r>
-    </w:p>
-    <w:p>
-      <w:r>
-        <w:t>Quotes include identifiers and expiry times where provided. Unknown intermediary or receiving charges must be disclosed rather than silently excluded. </w:t>
-      </w:r>
-    </w:p>
-    <w:p>
-      <w:r>
-        <w:t>Only a valid quote supported by the chosen sandbox route can proceed to sandbox payment authorization. </w:t>
-      </w:r>
-    </w:p>
-    <w:p>
-      <w:r>
-        <w:rPr>
-          <w:b/>
-          <w:bCs/>
-        </w:rPr>
-        <w:t>4.7 Lightweight Multi-Currency Funds Module</w:t>
-      </w:r>
-      <w:r>
-        <w:t> </w:t>
-      </w:r>
-    </w:p>
-    <w:p>
-      <w:r>
-        <w:t>This module maintains separate balances for each supported currency. </w:t>
-      </w:r>
-    </w:p>
-    <w:p>
-      <w:r>
-        <w:t>It displays: </w:t>
-      </w:r>
-    </w:p>
-    <w:p>
-      <w:pPr>
-        <w:numPr>
-          <w:ilvl w:val="0"/>
-          <w:numId w:val="18"/>
-        </w:numPr>
-      </w:pPr>
-      <w:r>
-        <w:t>Total recorded balance. </w:t>
-      </w:r>
-    </w:p>
-    <w:p>
-      <w:pPr>
-        <w:numPr>
-          <w:ilvl w:val="0"/>
-          <w:numId w:val="19"/>
-        </w:numPr>
-      </w:pPr>
-      <w:r>
-        <w:t>Available balance. </w:t>
-      </w:r>
-    </w:p>
-    <w:p>
-      <w:pPr>
-        <w:numPr>
-          <w:ilvl w:val="0"/>
-          <w:numId w:val="20"/>
-        </w:numPr>
-      </w:pPr>
-      <w:r>
-        <w:t>Funds reserved for pending transactions. </w:t>
-      </w:r>
-    </w:p>
-    <w:p>
-      <w:pPr>
-        <w:numPr>
-          <w:ilvl w:val="0"/>
-          <w:numId w:val="21"/>
-        </w:numPr>
-      </w:pPr>
-      <w:r>
-        <w:t>Transaction history. </w:t>
-      </w:r>
-    </w:p>
-    <w:p>
-      <w:pPr>
-        <w:numPr>
-          <w:ilvl w:val="0"/>
-          <w:numId w:val="22"/>
-        </w:numPr>
-      </w:pPr>
-      <w:r>
-        <w:t>Optional reference equivalents in a selected display currency. </w:t>
-      </w:r>
-    </w:p>
-    <w:p>
-      <w:r>
-        <w:t>Amounts in different currencies cannot be added directly. Reference equivalents require a rate source and timestamp and do not imply that a conversion has occurred. </w:t>
-      </w:r>
-    </w:p>
-    <w:p>
-      <w:r>
-        <w:t>For the core demonstration, the module should support at least two currencies involved in the selected sandbox route. </w:t>
-      </w:r>
-    </w:p>
-    <w:p>
-      <w:r>
-        <w:t>When a payment is authorized and submitted, the required test funds are reserved according to the sandbox funding model. On confirmed completion, the reservation is settled once. On confirmed failure or cancellation, it is released. </w:t>
-      </w:r>
-    </w:p>
-    <w:p>
-      <w:r>
-        <w:t>A timeout must not automatically release funds or trigger a second payment while the original outcome remains unknown. </w:t>
-      </w:r>
-    </w:p>
-    <w:p>
-      <w:r>
-        <w:t>User-entered balances used for planning must be distinguished from provider-reported sandbox balances. The application must not claim that an internal record proves funds exist with a provider. </w:t>
-      </w:r>
-    </w:p>
-    <w:p>
-      <w:r>
-        <w:rPr>
-          <w:b/>
-          <w:bCs/>
-        </w:rPr>
-        <w:t>4.8 Payment Goals and Optional Budget Module</w:t>
-      </w:r>
-      <w:r>
-        <w:t> </w:t>
-      </w:r>
-    </w:p>
-    <w:p>
-      <w:r>
-        <w:t>Users can define a payment target, purpose, currency, and deadline. </w:t>
-      </w:r>
-    </w:p>
-    <w:p>
-      <w:r>
-        <w:lastRenderedPageBreak/>
-        <w:t>Optional budgeting allows them to record upcoming income, expenses, and a safety buffer to understand the effect of a planned transfer. </w:t>
-      </w:r>
-    </w:p>
-    <w:p>
-      <w:r>
-        <w:t>Completed and planned transactions are separated to avoid double counting. </w:t>
-      </w:r>
-    </w:p>
-    <w:p>
-      <w:r>
-        <w:t>One-time and installment plans can be compared under explicit assumptions. Future rates and fees remain unknown until a valid quote is available. </w:t>
-      </w:r>
-    </w:p>
-    <w:p>
-      <w:r>
-        <w:t>A complete personal budget is not required to use the transfer flow. Budgeting remains a supporting feature rather than a prerequisite. </w:t>
-      </w:r>
-    </w:p>
-    <w:p>
-      <w:r>
-        <w:rPr>
-          <w:b/>
-          <w:bCs/>
-        </w:rPr>
-        <w:t>4.9 Natural Language AI Agent Module</w:t>
-      </w:r>
-      <w:r>
-        <w:t> </w:t>
-      </w:r>
-    </w:p>
-    <w:p>
-      <w:r>
-        <w:t>Users can retrieve information, compare options, update permitted settings, and prepare payments through conversation. </w:t>
-      </w:r>
-    </w:p>
-    <w:p>
-      <w:r>
-        <w:t>For example: </w:t>
-      </w:r>
-    </w:p>
-    <w:p>
-      <w:r>
-        <w:t>“Compare the available options, prepare a sandbox transfer of 100 AUD, and show me everything I need to approve.” </w:t>
-      </w:r>
-    </w:p>
-    <w:p>
-      <w:r>
-        <w:t>The Agent identifies intent, asks for missing details, invokes approved tools, and explains results. </w:t>
-      </w:r>
-    </w:p>
-    <w:p>
-      <w:r>
-        <w:t>It distinguishes observed data, historical statistics, forecasts, scenarios, and payment status. </w:t>
-      </w:r>
-    </w:p>
-    <w:p>
-      <w:r>
-        <w:t>Chat and on-screen controls use the same underlying state. The Agent cannot change amounts, recipients, or permissions without the required validation and confirmation. </w:t>
-      </w:r>
-    </w:p>
-    <w:p>
-      <w:r>
-        <w:t>Natural-language instructions are treated as requests. They do not override application-enforced permissions or transaction guardrails. </w:t>
-      </w:r>
-    </w:p>
-    <w:p>
-      <w:r>
-        <w:rPr>
-          <w:b/>
-          <w:bCs/>
-        </w:rPr>
-        <w:t>4.10 Permission Tiers and Guardrail Module</w:t>
-      </w:r>
-      <w:r>
-        <w:t> </w:t>
-      </w:r>
-    </w:p>
-    <w:p>
-      <w:r>
-        <w:t>This module controls which actions are allowed and under what conditions. </w:t>
-      </w:r>
-    </w:p>
-    <w:p>
-      <w:r>
-        <w:rPr>
-          <w:b/>
-          <w:bCs/>
-        </w:rPr>
-        <w:t>Tier 1 — View and Analyze</w:t>
-      </w:r>
-      <w:r>
-        <w:t> </w:t>
-      </w:r>
-    </w:p>
-    <w:p>
-      <w:r>
-        <w:t>Allows rate queries, historical analysis, permitted balance viewing, comparisons, and explanations. It cannot modify payment details or submit transactions. </w:t>
-      </w:r>
-    </w:p>
-    <w:p>
-      <w:r>
-        <w:rPr>
-          <w:b/>
-          <w:bCs/>
-        </w:rPr>
-        <w:t>Tier 2 — Prepare and Modify</w:t>
-      </w:r>
-      <w:r>
-        <w:t> </w:t>
-      </w:r>
-    </w:p>
-    <w:p>
-      <w:r>
-        <w:t>Allows the Agent to prepare transfer drafts and propose changes to settings, recipients, or plans. Changes are displayed before being committed. This tier does not authorize payment submission. </w:t>
-      </w:r>
-    </w:p>
-    <w:p>
-      <w:r>
-        <w:rPr>
-          <w:b/>
-          <w:bCs/>
-        </w:rPr>
-        <w:lastRenderedPageBreak/>
-        <w:t>Tier 3 — Authorize Sandbox Payment</w:t>
-      </w:r>
-      <w:r>
-        <w:t> </w:t>
-      </w:r>
-    </w:p>
-    <w:p>
-      <w:r>
-        <w:t>Allows the application to submit a specific sandbox payment after explicit user authorization. Authorization is tied to the displayed recipient, amount, currencies, fees, quote, and expiry. </w:t>
-      </w:r>
-    </w:p>
-    <w:p>
-      <w:r>
-        <w:t>Permission to submit one transaction does not authorize future transactions. </w:t>
-      </w:r>
-    </w:p>
-    <w:p>
-      <w:r>
-        <w:t>Administrative configuration is a separate role, not an automatic payment privilege. The Agent cannot assign itself roles or increase limits. </w:t>
-      </w:r>
-    </w:p>
-    <w:p>
-      <w:r>
-        <w:t>Transaction guardrails include: </w:t>
-      </w:r>
-    </w:p>
-    <w:p>
-      <w:pPr>
-        <w:numPr>
-          <w:ilvl w:val="0"/>
-          <w:numId w:val="23"/>
-        </w:numPr>
-      </w:pPr>
-      <w:r>
-        <w:t>Available-funds checks. </w:t>
-      </w:r>
-    </w:p>
-    <w:p>
-      <w:pPr>
-        <w:numPr>
-          <w:ilvl w:val="0"/>
-          <w:numId w:val="24"/>
-        </w:numPr>
-      </w:pPr>
-      <w:r>
-        <w:t>Per-transaction and cumulative test limits. </w:t>
-      </w:r>
-    </w:p>
-    <w:p>
-      <w:pPr>
-        <w:numPr>
-          <w:ilvl w:val="0"/>
-          <w:numId w:val="25"/>
-        </w:numPr>
-      </w:pPr>
-      <w:r>
-        <w:t>Supported-route and recipient validation. </w:t>
-      </w:r>
-    </w:p>
-    <w:p>
-      <w:pPr>
-        <w:numPr>
-          <w:ilvl w:val="0"/>
-          <w:numId w:val="26"/>
-        </w:numPr>
-      </w:pPr>
-      <w:r>
-        <w:t>Quote-expiry checks. </w:t>
-      </w:r>
-    </w:p>
-    <w:p>
-      <w:pPr>
-        <w:numPr>
-          <w:ilvl w:val="0"/>
-          <w:numId w:val="27"/>
-        </w:numPr>
-      </w:pPr>
-      <w:r>
-        <w:t>Duplicate-submission protection. </w:t>
-      </w:r>
-    </w:p>
-    <w:p>
-      <w:pPr>
-        <w:numPr>
-          <w:ilvl w:val="0"/>
-          <w:numId w:val="28"/>
-        </w:numPr>
-      </w:pPr>
-      <w:r>
-        <w:t>Required-field validation. </w:t>
-      </w:r>
-    </w:p>
-    <w:p>
-      <w:pPr>
-        <w:numPr>
-          <w:ilvl w:val="0"/>
-          <w:numId w:val="29"/>
-        </w:numPr>
-      </w:pPr>
-      <w:r>
-        <w:t>Detection of changed payment details after approval. </w:t>
-      </w:r>
-    </w:p>
-    <w:p>
-      <w:pPr>
-        <w:numPr>
-          <w:ilvl w:val="0"/>
-          <w:numId w:val="30"/>
-        </w:numPr>
-      </w:pPr>
-      <w:r>
-        <w:t>Blocking live payment environments in the sandbox release. </w:t>
-      </w:r>
-    </w:p>
-    <w:p>
-      <w:r>
-        <w:t>Checks run before authorization and again before submission where relevant. </w:t>
-      </w:r>
-    </w:p>
-    <w:p>
-      <w:r>
-        <w:t>Changes to the recipient, amount, currency, fee, or expired quote require renewed approval. A general response such as “okay” must not authorize an ambiguous payment. </w:t>
-      </w:r>
-    </w:p>
-    <w:p>
-      <w:r>
-        <w:rPr>
-          <w:b/>
-          <w:bCs/>
-        </w:rPr>
-        <w:t>4.11 End-to-End Sandbox Transfer Module</w:t>
-      </w:r>
-      <w:r>
-        <w:t> </w:t>
-      </w:r>
-    </w:p>
-    <w:p>
-      <w:r>
-        <w:t>The first release must complete one working provider-supported sandbox transfer, rather than stopping at a recommendation or simulated approval. </w:t>
-      </w:r>
-    </w:p>
-    <w:p>
-      <w:r>
-        <w:t>The flow includes: </w:t>
-      </w:r>
-    </w:p>
-    <w:p>
-      <w:pPr>
-        <w:numPr>
-          <w:ilvl w:val="0"/>
-          <w:numId w:val="31"/>
-        </w:numPr>
-      </w:pPr>
-      <w:r>
-        <w:rPr>
-          <w:b/>
-          <w:bCs/>
-        </w:rPr>
-        <w:t>Create the request.</w:t>
-      </w:r>
-      <w:r>
-        <w:t> </w:t>
-      </w:r>
-      <w:r>
-        <w:br/>
-        <w:t>Capture the amount, source currency, target currency, recipient, purpose, and timing requirements. </w:t>
-      </w:r>
-    </w:p>
-    <w:p>
-      <w:pPr>
-        <w:numPr>
-          <w:ilvl w:val="0"/>
-          <w:numId w:val="32"/>
-        </w:numPr>
-      </w:pPr>
-      <w:r>
-        <w:rPr>
-          <w:b/>
-          <w:bCs/>
-        </w:rPr>
-        <w:t>Obtain a sandbox quote.</w:t>
-      </w:r>
-      <w:r>
-        <w:t> </w:t>
-      </w:r>
-      <w:r>
-        <w:br/>
-        <w:t>Retrieve a valid quote with fees, rate, expected receiving amount, identifier, and expiry where supported. </w:t>
-      </w:r>
-    </w:p>
-    <w:p>
-      <w:pPr>
-        <w:numPr>
-          <w:ilvl w:val="0"/>
-          <w:numId w:val="33"/>
-        </w:numPr>
-      </w:pPr>
-      <w:r>
-        <w:rPr>
-          <w:b/>
-          <w:bCs/>
-        </w:rPr>
-        <w:lastRenderedPageBreak/>
-        <w:t>Run guardrail checks.</w:t>
-      </w:r>
-      <w:r>
-        <w:t> </w:t>
-      </w:r>
-      <w:r>
-        <w:br/>
-        <w:t>Verify permissions, available test funds, limits, route support, recipient details, and duplicate status. </w:t>
-      </w:r>
-    </w:p>
-    <w:p>
-      <w:pPr>
-        <w:numPr>
-          <w:ilvl w:val="0"/>
-          <w:numId w:val="34"/>
-        </w:numPr>
-      </w:pPr>
-      <w:r>
-        <w:rPr>
-          <w:b/>
-          <w:bCs/>
-        </w:rPr>
-        <w:t>Present the authorization screen.</w:t>
-      </w:r>
-      <w:r>
-        <w:t> </w:t>
-      </w:r>
-      <w:r>
-        <w:br/>
-        <w:t>Display the sandbox environment, recipient, sending amount, currencies, fees, expected receiving amount, and delivery estimate. </w:t>
-      </w:r>
-    </w:p>
-    <w:p>
-      <w:pPr>
-        <w:numPr>
-          <w:ilvl w:val="0"/>
-          <w:numId w:val="35"/>
-        </w:numPr>
-      </w:pPr>
-      <w:r>
-        <w:rPr>
-          <w:b/>
-          <w:bCs/>
-        </w:rPr>
-        <w:t>Obtain explicit user authorization.</w:t>
-      </w:r>
-      <w:r>
-        <w:t> </w:t>
-      </w:r>
-      <w:r>
-        <w:br/>
-        <w:t>Bind approval to the exact payment details. Preparing a draft or accepting a recommendation is insufficient. </w:t>
-      </w:r>
-    </w:p>
-    <w:p>
-      <w:pPr>
-        <w:numPr>
-          <w:ilvl w:val="0"/>
-          <w:numId w:val="36"/>
-        </w:numPr>
-      </w:pPr>
-      <w:r>
-        <w:rPr>
-          <w:b/>
-          <w:bCs/>
-        </w:rPr>
-        <w:t>Submit the transaction.</w:t>
-      </w:r>
-      <w:r>
-        <w:t> </w:t>
-      </w:r>
-      <w:r>
-        <w:br/>
-        <w:t>Send the request using a unique transaction identifier and idempotency protection. </w:t>
-      </w:r>
-    </w:p>
-    <w:p>
-      <w:pPr>
-        <w:numPr>
-          <w:ilvl w:val="0"/>
-          <w:numId w:val="37"/>
-        </w:numPr>
-      </w:pPr>
-      <w:r>
-        <w:rPr>
-          <w:b/>
-          <w:bCs/>
-        </w:rPr>
-        <w:t>Track the outcome.</w:t>
-      </w:r>
-      <w:r>
-        <w:t> </w:t>
-      </w:r>
-      <w:r>
-        <w:br/>
-        <w:t>Query the provider or process verified status notifications until completion, failure, cancellation, or another provider-defined state is established. </w:t>
-      </w:r>
-    </w:p>
-    <w:p>
-      <w:pPr>
-        <w:numPr>
-          <w:ilvl w:val="0"/>
-          <w:numId w:val="38"/>
-        </w:numPr>
-      </w:pPr>
-      <w:r>
-        <w:rPr>
-          <w:b/>
-          <w:bCs/>
-        </w:rPr>
-        <w:t>Update balances and show a receipt.</w:t>
-      </w:r>
-      <w:r>
-        <w:t> </w:t>
-      </w:r>
-      <w:r>
-        <w:br/>
-        <w:t>Settle or release reserved test funds according to the confirmed outcome and display the transaction reference and final status. </w:t>
-      </w:r>
-    </w:p>
-    <w:p>
-      <w:r>
-        <w:t>A submitted or accepted request must not be displayed as completed. </w:t>
-      </w:r>
-    </w:p>
-    <w:p>
-      <w:r>
-        <w:t>If a timeout occurs after submission, the system treats the outcome as unknown and checks the existing transaction before retrying. It must not create a second transfer with a new identifier. </w:t>
-      </w:r>
-    </w:p>
-    <w:p>
-      <w:r>
-        <w:t>Failures and cancellations release reserved funds only after the outcome is established. </w:t>
-      </w:r>
-    </w:p>
-    <w:p>
-      <w:r>
-        <w:t>A tuition payment can be used instead of a general remittance if the chosen provider’s sandbox supports the relevant payee and payment flow. The team should implement one flow deeply before adding another. </w:t>
-      </w:r>
-    </w:p>
-    <w:p>
-      <w:r>
-        <w:t>If no provider sandbox is connected, a local simulation must be labeled as such. It does not satisfy the working provider-sandbox transaction requirement. </w:t>
-      </w:r>
-    </w:p>
-    <w:p>
-      <w:r>
-        <w:rPr>
-          <w:b/>
-          <w:bCs/>
-        </w:rPr>
-        <w:t>4.12 User Approval and Transaction History Module</w:t>
-      </w:r>
-      <w:r>
-        <w:t> </w:t>
-      </w:r>
-    </w:p>
-    <w:p>
-      <w:r>
-        <w:t>The product distinguishes three actions: </w:t>
-      </w:r>
-    </w:p>
-    <w:p>
-      <w:pPr>
-        <w:numPr>
-          <w:ilvl w:val="0"/>
-          <w:numId w:val="39"/>
-        </w:numPr>
-      </w:pPr>
-      <w:r>
-        <w:t>Accepting an informational recommendation. </w:t>
-      </w:r>
-    </w:p>
-    <w:p>
-      <w:pPr>
-        <w:numPr>
-          <w:ilvl w:val="0"/>
-          <w:numId w:val="40"/>
-        </w:numPr>
-      </w:pPr>
-      <w:r>
-        <w:t>Confirming a draft change. </w:t>
-      </w:r>
-    </w:p>
-    <w:p>
-      <w:pPr>
-        <w:numPr>
-          <w:ilvl w:val="0"/>
-          <w:numId w:val="41"/>
-        </w:numPr>
-      </w:pPr>
-      <w:r>
-        <w:lastRenderedPageBreak/>
-        <w:t>Authorizing a specific sandbox payment. </w:t>
-      </w:r>
-    </w:p>
-    <w:p>
-      <w:r>
-        <w:t>Each has its own status and record. </w:t>
-      </w:r>
-    </w:p>
-    <w:p>
-      <w:r>
-        <w:t>Payment authorization preserves the approved details and quote. Changes invalidate the authorization and require a new decision. </w:t>
-      </w:r>
-    </w:p>
-    <w:p>
-      <w:r>
-        <w:t>History shows drafts, approvals, submissions, provider references, final outcomes, and any unresolved transactions. </w:t>
-      </w:r>
-    </w:p>
-    <w:p>
-      <w:r>
-        <w:t>Accepting a plan does not change real balances. Sandbox balances change only through the defined sandbox transaction lifecycle. </w:t>
-      </w:r>
-    </w:p>
-    <w:p>
-      <w:r>
-        <w:t>Previously completed transactions remain historical records even when current rates or settings change. </w:t>
-      </w:r>
-    </w:p>
-    <w:p>
-      <w:r>
-        <w:rPr>
-          <w:b/>
-          <w:bCs/>
-        </w:rPr>
-        <w:t>4.13 Audit Log Module</w:t>
-      </w:r>
-      <w:r>
-        <w:t> </w:t>
-      </w:r>
-    </w:p>
-    <w:p>
-      <w:r>
-        <w:t>The audit log provides a chronological record of significant actions and decisions. </w:t>
-      </w:r>
-    </w:p>
-    <w:p>
-      <w:r>
-        <w:t>Events include: </w:t>
-      </w:r>
-    </w:p>
-    <w:p>
-      <w:pPr>
-        <w:numPr>
-          <w:ilvl w:val="0"/>
-          <w:numId w:val="42"/>
-        </w:numPr>
-      </w:pPr>
-      <w:r>
-        <w:t>User requests and action identifiers. </w:t>
-      </w:r>
-    </w:p>
-    <w:p>
-      <w:pPr>
-        <w:numPr>
-          <w:ilvl w:val="0"/>
-          <w:numId w:val="43"/>
-        </w:numPr>
-      </w:pPr>
-      <w:r>
-        <w:t>Agent tool requests and outcomes. </w:t>
-      </w:r>
-    </w:p>
-    <w:p>
-      <w:pPr>
-        <w:numPr>
-          <w:ilvl w:val="0"/>
-          <w:numId w:val="44"/>
-        </w:numPr>
-      </w:pPr>
-      <w:r>
-        <w:t>Permission checks. </w:t>
-      </w:r>
-    </w:p>
-    <w:p>
-      <w:pPr>
-        <w:numPr>
-          <w:ilvl w:val="0"/>
-          <w:numId w:val="45"/>
-        </w:numPr>
-      </w:pPr>
-      <w:r>
-        <w:t>Guardrail passes, warnings, and denials. </w:t>
-      </w:r>
-    </w:p>
-    <w:p>
-      <w:pPr>
-        <w:numPr>
-          <w:ilvl w:val="0"/>
-          <w:numId w:val="46"/>
-        </w:numPr>
-      </w:pPr>
-      <w:r>
-        <w:t>Draft creation and modification. </w:t>
-      </w:r>
-    </w:p>
-    <w:p>
-      <w:pPr>
-        <w:numPr>
-          <w:ilvl w:val="0"/>
-          <w:numId w:val="47"/>
-        </w:numPr>
-      </w:pPr>
-      <w:r>
-        <w:t>User authorization. </w:t>
-      </w:r>
-    </w:p>
-    <w:p>
-      <w:pPr>
-        <w:numPr>
-          <w:ilvl w:val="0"/>
-          <w:numId w:val="48"/>
-        </w:numPr>
-      </w:pPr>
-      <w:r>
-        <w:t>Quote selection and expiry. </w:t>
-      </w:r>
-    </w:p>
-    <w:p>
-      <w:pPr>
-        <w:numPr>
-          <w:ilvl w:val="0"/>
-          <w:numId w:val="49"/>
-        </w:numPr>
-      </w:pPr>
-      <w:r>
-        <w:t>Transaction submission. </w:t>
-      </w:r>
-    </w:p>
-    <w:p>
-      <w:pPr>
-        <w:numPr>
-          <w:ilvl w:val="0"/>
-          <w:numId w:val="50"/>
-        </w:numPr>
-      </w:pPr>
-      <w:r>
-        <w:t>Provider status updates. </w:t>
-      </w:r>
-    </w:p>
-    <w:p>
-      <w:pPr>
-        <w:numPr>
-          <w:ilvl w:val="0"/>
-          <w:numId w:val="51"/>
-        </w:numPr>
-      </w:pPr>
-      <w:r>
-        <w:t>Balance reservations, settlements, and releases. </w:t>
-      </w:r>
-    </w:p>
-    <w:p>
-      <w:pPr>
-        <w:numPr>
-          <w:ilvl w:val="0"/>
-          <w:numId w:val="52"/>
-        </w:numPr>
-      </w:pPr>
-      <w:r>
-        <w:t>Errors and recovery actions. </w:t>
-      </w:r>
-    </w:p>
-    <w:p>
-      <w:r>
-        <w:t>Each event contains a timestamp, actor, action, outcome, correlation identifier, and relevant transaction or approval reference. </w:t>
-      </w:r>
-    </w:p>
-    <w:p>
-      <w:r>
-        <w:t>Sensitive information is masked. Credentials, access tokens, and unnecessary full financial identifiers must not be logged. </w:t>
-      </w:r>
-    </w:p>
-    <w:p>
-      <w:r>
-        <w:lastRenderedPageBreak/>
-        <w:t>Logs should be append-only through the application, with corrections recorded as new events. The prototype must not claim cryptographic immutability unless that protection is implemented. </w:t>
-      </w:r>
-    </w:p>
-    <w:p>
-      <w:r>
-        <w:t>The audit view should make it possible to answer: </w:t>
-      </w:r>
-    </w:p>
-    <w:p>
-      <w:r>
-        <w:t>“Who authorized this action, what details were approved, which checks ran, and what happened afterward?” </w:t>
-      </w:r>
-    </w:p>
-    <w:p>
-      <w:r>
-        <w:t>Access to audit records is permission-controlled, and denied actions are logged as well as successful ones. </w:t>
-      </w:r>
-    </w:p>
-    <w:p>
-      <w:r>
-        <w:rPr>
-          <w:b/>
-          <w:bCs/>
-        </w:rPr>
-        <w:t>4.14 Lightweight Credit-Building Support Module</w:t>
-      </w:r>
-      <w:r>
-        <w:t> </w:t>
-      </w:r>
-    </w:p>
-    <w:p>
-      <w:r>
-        <w:t>This module supports payment habits and credit education without presenting itself as a credit bureau or lender. </w:t>
-      </w:r>
-    </w:p>
-    <w:p>
-      <w:r>
-        <w:t>Initial features include: </w:t>
-      </w:r>
-    </w:p>
-    <w:p>
-      <w:pPr>
-        <w:numPr>
-          <w:ilvl w:val="0"/>
-          <w:numId w:val="53"/>
-        </w:numPr>
-      </w:pPr>
-      <w:r>
-        <w:t>Payment due-date tracking. </w:t>
-      </w:r>
-    </w:p>
-    <w:p>
-      <w:pPr>
-        <w:numPr>
-          <w:ilvl w:val="0"/>
-          <w:numId w:val="54"/>
-        </w:numPr>
-      </w:pPr>
-      <w:r>
-        <w:t>On-time and late-payment history for eligible recorded obligations. </w:t>
-      </w:r>
-    </w:p>
-    <w:p>
-      <w:pPr>
-        <w:numPr>
-          <w:ilvl w:val="0"/>
-          <w:numId w:val="55"/>
-        </w:numPr>
-      </w:pPr>
-      <w:r>
-        <w:t>Reminder support. </w:t>
-      </w:r>
-    </w:p>
-    <w:p>
-      <w:pPr>
-        <w:numPr>
-          <w:ilvl w:val="0"/>
-          <w:numId w:val="56"/>
-        </w:numPr>
-      </w:pPr>
-      <w:r>
-        <w:t>Explanations of common credit-related concepts. </w:t>
-      </w:r>
-    </w:p>
-    <w:p>
-      <w:pPr>
-        <w:numPr>
-          <w:ilvl w:val="0"/>
-          <w:numId w:val="57"/>
-        </w:numPr>
-      </w:pPr>
-      <w:r>
-        <w:t>A simple overview of recorded payment consistency. </w:t>
-      </w:r>
-    </w:p>
-    <w:p>
-      <w:r>
-        <w:t>The overview must be labeled as an internal payment-habit indicator, not an official credit score. </w:t>
-      </w:r>
-    </w:p>
-    <w:p>
-      <w:r>
-        <w:t>The product does not claim that a remittance automatically builds credit, improves a score, or has been reported to a credit bureau. </w:t>
-      </w:r>
-    </w:p>
-    <w:p>
-      <w:r>
-        <w:t>Sandbox transactions are demonstration records. They cannot establish actual credit history. </w:t>
-      </w:r>
-    </w:p>
-    <w:p>
-      <w:r>
-        <w:t>Future integration with recognized reporting or financial partners would require verified eligibility, user consent, and confirmation that reporting has actually occurred. </w:t>
-      </w:r>
-    </w:p>
-    <w:p>
-      <w:r>
-        <w:t>The initial module should remain lightweight and reuse confirmed payment records rather than introduce a complex scoring system. </w:t>
-      </w:r>
-    </w:p>
-    <w:p>
-      <w:r>
-        <w:rPr>
-          <w:b/>
-          <w:bCs/>
-        </w:rPr>
-        <w:t>4.15 Reminders and Essential Transaction Summaries Module</w:t>
-      </w:r>
-      <w:r>
-        <w:t> </w:t>
-      </w:r>
-    </w:p>
-    <w:p>
-      <w:r>
-        <w:t>The first release focuses on reminders directly supporting the payment workflow: </w:t>
-      </w:r>
-    </w:p>
-    <w:p>
-      <w:pPr>
-        <w:numPr>
-          <w:ilvl w:val="0"/>
-          <w:numId w:val="58"/>
-        </w:numPr>
-      </w:pPr>
-      <w:r>
-        <w:lastRenderedPageBreak/>
-        <w:t>Payment deadlines. </w:t>
-      </w:r>
-    </w:p>
-    <w:p>
-      <w:pPr>
-        <w:numPr>
-          <w:ilvl w:val="0"/>
-          <w:numId w:val="59"/>
-        </w:numPr>
-      </w:pPr>
-      <w:r>
-        <w:t>Quote expiry. </w:t>
-      </w:r>
-    </w:p>
-    <w:p>
-      <w:pPr>
-        <w:numPr>
-          <w:ilvl w:val="0"/>
-          <w:numId w:val="60"/>
-        </w:numPr>
-      </w:pPr>
-      <w:r>
-        <w:t>Unresolved transaction status. </w:t>
-      </w:r>
-    </w:p>
-    <w:p>
-      <w:pPr>
-        <w:numPr>
-          <w:ilvl w:val="0"/>
-          <w:numId w:val="61"/>
-        </w:numPr>
-      </w:pPr>
-      <w:r>
-        <w:t>Insufficient available funds. </w:t>
-      </w:r>
-    </w:p>
-    <w:p>
-      <w:pPr>
-        <w:numPr>
-          <w:ilvl w:val="0"/>
-          <w:numId w:val="62"/>
-        </w:numPr>
-      </w:pPr>
-      <w:r>
-        <w:t>Optional target-rate conditions. </w:t>
-      </w:r>
-    </w:p>
-    <w:p>
-      <w:r>
-        <w:t>Alerts should reflect actual data updates and avoid repeated notifications when nothing meaningful changes. </w:t>
-      </w:r>
-    </w:p>
-    <w:p>
-      <w:r>
-        <w:t>Basic transaction receipts and history remain essential. They show the payment reference, amount, currencies, fees, timestamps, status, and sandbox label. </w:t>
-      </w:r>
-    </w:p>
-    <w:p>
-      <w:r>
-        <w:t>Extensive multilingual reports, multiple export formats, elaborate dashboards, and recurring financial summaries are lower priorities. </w:t>
-      </w:r>
-    </w:p>
-    <w:p>
-      <w:r>
-        <w:t>The core interface can support a small number of languages first, with further translations added after the transaction workflow is reliable. </w:t>
-      </w:r>
-    </w:p>
-    <w:p>
-      <w:r>
-        <w:rPr>
-          <w:b/>
-          <w:bCs/>
-        </w:rPr>
-        <w:t>5 First-Release Priorities and Product Stages</w:t>
-      </w:r>
-      <w:r>
-        <w:t> </w:t>
-      </w:r>
-    </w:p>
-    <w:p>
-      <w:r>
-        <w:rPr>
-          <w:b/>
-          <w:bCs/>
-        </w:rPr>
-        <w:t>5.1 Essential Working Core</w:t>
-      </w:r>
-      <w:r>
-        <w:t> </w:t>
-      </w:r>
-    </w:p>
-    <w:p>
-      <w:r>
-        <w:t>The forty-eight-hour release prioritizes: </w:t>
-      </w:r>
-    </w:p>
-    <w:p>
-      <w:pPr>
-        <w:numPr>
-          <w:ilvl w:val="0"/>
-          <w:numId w:val="63"/>
-        </w:numPr>
-      </w:pPr>
-      <w:r>
-        <w:t>One validated provider-supported sandbox route. </w:t>
-      </w:r>
-    </w:p>
-    <w:p>
-      <w:pPr>
-        <w:numPr>
-          <w:ilvl w:val="0"/>
-          <w:numId w:val="64"/>
-        </w:numPr>
-      </w:pPr>
-      <w:r>
-        <w:t>A complete request-to-receipt transaction flow. </w:t>
-      </w:r>
-    </w:p>
-    <w:p>
-      <w:pPr>
-        <w:numPr>
-          <w:ilvl w:val="0"/>
-          <w:numId w:val="65"/>
-        </w:numPr>
-      </w:pPr>
-      <w:r>
-        <w:t>Natural-language preparation backed by application validation. </w:t>
-      </w:r>
-    </w:p>
-    <w:p>
-      <w:pPr>
-        <w:numPr>
-          <w:ilvl w:val="0"/>
-          <w:numId w:val="66"/>
-        </w:numPr>
-      </w:pPr>
-      <w:r>
-        <w:t>Permission tiers and transaction guardrails. </w:t>
-      </w:r>
-    </w:p>
-    <w:p>
-      <w:pPr>
-        <w:numPr>
-          <w:ilvl w:val="0"/>
-          <w:numId w:val="67"/>
-        </w:numPr>
-      </w:pPr>
-      <w:r>
-        <w:t>Explicit authorization tied to payment details. </w:t>
-      </w:r>
-    </w:p>
-    <w:p>
-      <w:pPr>
-        <w:numPr>
-          <w:ilvl w:val="0"/>
-          <w:numId w:val="68"/>
-        </w:numPr>
-      </w:pPr>
-      <w:r>
-        <w:t>Separate multi-currency test balances and reservations. </w:t>
-      </w:r>
-    </w:p>
-    <w:p>
-      <w:pPr>
-        <w:numPr>
-          <w:ilvl w:val="0"/>
-          <w:numId w:val="69"/>
-        </w:numPr>
-      </w:pPr>
-      <w:r>
-        <w:t>Duplicate protection and recovery from uncertain outcomes. </w:t>
-      </w:r>
-    </w:p>
-    <w:p>
-      <w:pPr>
-        <w:numPr>
-          <w:ilvl w:val="0"/>
-          <w:numId w:val="70"/>
-        </w:numPr>
-      </w:pPr>
-      <w:r>
-        <w:t>An audit log and basic transaction history. </w:t>
-      </w:r>
-    </w:p>
-    <w:p>
-      <w:pPr>
-        <w:numPr>
-          <w:ilvl w:val="0"/>
-          <w:numId w:val="71"/>
-        </w:numPr>
-      </w:pPr>
-      <w:r>
-        <w:t>Minimal payment reminders and credit-education features. </w:t>
-      </w:r>
-    </w:p>
-    <w:p>
-      <w:r>
-        <w:t>The application should make clear whether each result comes from an actual reference source, a provider sandbox, or a local simulation. </w:t>
-      </w:r>
-    </w:p>
-    <w:p>
-      <w:r>
-        <w:rPr>
-          <w:b/>
-          <w:bCs/>
-        </w:rPr>
-        <w:lastRenderedPageBreak/>
-        <w:t>5.2 Supporting Features</w:t>
-      </w:r>
-      <w:r>
-        <w:t> </w:t>
-      </w:r>
-    </w:p>
-    <w:p>
-      <w:r>
-        <w:t>Latest reference rates, fee comparisons, and simple historical analysis support the core experience where data is available. </w:t>
-      </w:r>
-    </w:p>
-    <w:p>
-      <w:r>
-        <w:t>Scenario calculations may remain lightweight. Forecasting is optional and must not delay completion of the transaction workflow. </w:t>
-      </w:r>
-    </w:p>
-    <w:p>
-      <w:r>
-        <w:t>Credit-building support is limited to payment records, reminders, and education. Additional currencies and regional modules are introduced only after the core route works. </w:t>
-      </w:r>
-    </w:p>
-    <w:p>
-      <w:r>
-        <w:rPr>
-          <w:b/>
-          <w:bCs/>
-        </w:rPr>
-        <w:t>5.3 Features to Defer if Time Is Tight</w:t>
-      </w:r>
-      <w:r>
-        <w:t> </w:t>
-      </w:r>
-    </w:p>
-    <w:p>
-      <w:r>
-        <w:t>Lower-priority items include: </w:t>
-      </w:r>
-    </w:p>
-    <w:p>
-      <w:pPr>
-        <w:numPr>
-          <w:ilvl w:val="0"/>
-          <w:numId w:val="72"/>
-        </w:numPr>
-      </w:pPr>
-      <w:r>
-        <w:t>Thirty-day forecasting and sophisticated prediction models. </w:t>
-      </w:r>
-    </w:p>
-    <w:p>
-      <w:pPr>
-        <w:numPr>
-          <w:ilvl w:val="0"/>
-          <w:numId w:val="73"/>
-        </w:numPr>
-      </w:pPr>
-      <w:r>
-        <w:t>Large numbers of regional templates. </w:t>
-      </w:r>
-    </w:p>
-    <w:p>
-      <w:pPr>
-        <w:numPr>
-          <w:ilvl w:val="0"/>
-          <w:numId w:val="74"/>
-        </w:numPr>
-      </w:pPr>
-      <w:r>
-        <w:t>Multiple payment providers. </w:t>
-      </w:r>
-    </w:p>
-    <w:p>
-      <w:pPr>
-        <w:numPr>
-          <w:ilvl w:val="0"/>
-          <w:numId w:val="75"/>
-        </w:numPr>
-      </w:pPr>
-      <w:r>
-        <w:t>Detailed installment optimization. </w:t>
-      </w:r>
-    </w:p>
-    <w:p>
-      <w:pPr>
-        <w:numPr>
-          <w:ilvl w:val="0"/>
-          <w:numId w:val="76"/>
-        </w:numPr>
-      </w:pPr>
-      <w:r>
-        <w:t>Broad background-alert infrastructure. </w:t>
-      </w:r>
-    </w:p>
-    <w:p>
-      <w:pPr>
-        <w:numPr>
-          <w:ilvl w:val="0"/>
-          <w:numId w:val="77"/>
-        </w:numPr>
-      </w:pPr>
-      <w:r>
-        <w:t>Extensive reports, dashboards, and export formats. </w:t>
-      </w:r>
-    </w:p>
-    <w:p>
-      <w:pPr>
-        <w:numPr>
-          <w:ilvl w:val="0"/>
-          <w:numId w:val="78"/>
-        </w:numPr>
-      </w:pPr>
-      <w:r>
-        <w:t>Formal credit scoring or bureau reporting. </w:t>
-      </w:r>
-    </w:p>
-    <w:p>
-      <w:pPr>
-        <w:numPr>
-          <w:ilvl w:val="0"/>
-          <w:numId w:val="79"/>
-        </w:numPr>
-      </w:pPr>
-      <w:r>
-        <w:t>Live transfers involving real money. </w:t>
-      </w:r>
-    </w:p>
-    <w:p>
-      <w:r>
-        <w:t>A deep, working core takes priority over a broad feature list. </w:t>
-      </w:r>
-    </w:p>
-    <w:p>
-      <w:r>
-        <w:rPr>
-          <w:b/>
-          <w:bCs/>
-        </w:rPr>
-        <w:t>6 Typical Use Cases</w:t>
-      </w:r>
-      <w:r>
-        <w:t> </w:t>
-      </w:r>
-    </w:p>
-    <w:p>
-      <w:r>
-        <w:rPr>
-          <w:b/>
-          <w:bCs/>
-        </w:rPr>
-        <w:t>6.1 Family Support</w:t>
-      </w:r>
-      <w:r>
-        <w:t> </w:t>
-      </w:r>
-    </w:p>
-    <w:p>
-      <w:r>
-        <w:t>A user compares options for supporting family overseas, prepares a sandbox transfer, reviews the recipient and total cost, authorizes the payment, and receives a final sandbox status and receipt. </w:t>
-      </w:r>
-    </w:p>
-    <w:p>
-      <w:r>
-        <w:rPr>
-          <w:b/>
-          <w:bCs/>
-        </w:rPr>
-        <w:t>6.2 Overseas Work and Living</w:t>
-      </w:r>
-      <w:r>
-        <w:t> </w:t>
-      </w:r>
-    </w:p>
-    <w:p>
-      <w:r>
-        <w:t>A user holds funds in multiple currencies, checks available and reserved balances, and evaluates a transfer without confusing reference equivalents with spendable funds. </w:t>
-      </w:r>
-    </w:p>
-    <w:p>
-      <w:r>
-        <w:rPr>
-          <w:b/>
-          <w:bCs/>
-        </w:rPr>
-        <w:t>6.3 Tuition Payments</w:t>
-      </w:r>
-      <w:r>
-        <w:t> </w:t>
-      </w:r>
-    </w:p>
-    <w:p>
-      <w:r>
-        <w:lastRenderedPageBreak/>
-        <w:t>A user sets a tuition amount and deadline. If the selected sandbox supports the required payment flow, the assistant prepares the payment for explicit authorization and tracks its outcome. Otherwise, it provides planning and comparison only. </w:t>
-      </w:r>
-    </w:p>
-    <w:p>
-      <w:r>
-        <w:rPr>
-          <w:b/>
-          <w:bCs/>
-        </w:rPr>
-        <w:t>6.4 Freelance or Business Payments</w:t>
-      </w:r>
-      <w:r>
-        <w:t> </w:t>
-      </w:r>
-    </w:p>
-    <w:p>
-      <w:r>
-        <w:t>A user evaluates overseas income or payment requirements. Actual provider eligibility for business purposes is checked separately; personal-route support must not be assumed to cover business transactions. </w:t>
-      </w:r>
-    </w:p>
-    <w:p>
-      <w:r>
-        <w:rPr>
-          <w:b/>
-          <w:bCs/>
-        </w:rPr>
-        <w:t>6.5 Payment-Habit Support</w:t>
-      </w:r>
-      <w:r>
-        <w:t> </w:t>
-      </w:r>
-    </w:p>
-    <w:p>
-      <w:r>
-        <w:t>A user reviews upcoming obligations and recorded payment timing. The assistant provides reminders and educational explanations without representing the information as an official credit score. </w:t>
-      </w:r>
-    </w:p>
-    <w:p>
-      <w:r>
-        <w:rPr>
-          <w:b/>
-          <w:bCs/>
-        </w:rPr>
-        <w:t>7 Product Value and Validation Priorities</w:t>
-      </w:r>
-      <w:r>
-        <w:t> </w:t>
-      </w:r>
-    </w:p>
-    <w:p>
-      <w:r>
-        <w:t>The product combines understandable financial information with controlled action. Users can compare options, inspect a proposed payment, authorize it within defined permissions, and trace its outcome. </w:t>
-      </w:r>
-    </w:p>
-    <w:p>
-      <w:r>
-        <w:t>Validation should confirm that: </w:t>
-      </w:r>
-    </w:p>
-    <w:p>
-      <w:pPr>
-        <w:numPr>
-          <w:ilvl w:val="0"/>
-          <w:numId w:val="80"/>
-        </w:numPr>
-      </w:pPr>
-      <w:r>
-        <w:t>Users understand the difference between reference rates, sandbox quotes, and live offers. </w:t>
-      </w:r>
-    </w:p>
-    <w:p>
-      <w:pPr>
-        <w:numPr>
-          <w:ilvl w:val="0"/>
-          <w:numId w:val="81"/>
-        </w:numPr>
-      </w:pPr>
-      <w:r>
-        <w:t>The Agent cannot bypass permissions or authorize its own transaction. </w:t>
-      </w:r>
-    </w:p>
-    <w:p>
-      <w:pPr>
-        <w:numPr>
-          <w:ilvl w:val="0"/>
-          <w:numId w:val="82"/>
-        </w:numPr>
-      </w:pPr>
-      <w:r>
-        <w:t>Changed or expired payment details require renewed approval. </w:t>
-      </w:r>
-    </w:p>
-    <w:p>
-      <w:pPr>
-        <w:numPr>
-          <w:ilvl w:val="0"/>
-          <w:numId w:val="83"/>
-        </w:numPr>
-      </w:pPr>
-      <w:r>
-        <w:t>Insufficient funds and limit breaches block submission. </w:t>
-      </w:r>
-    </w:p>
-    <w:p>
-      <w:pPr>
-        <w:numPr>
-          <w:ilvl w:val="0"/>
-          <w:numId w:val="84"/>
-        </w:numPr>
-      </w:pPr>
-      <w:r>
-        <w:t>Duplicate requests do not create duplicate payments. </w:t>
-      </w:r>
-    </w:p>
-    <w:p>
-      <w:pPr>
-        <w:numPr>
-          <w:ilvl w:val="0"/>
-          <w:numId w:val="85"/>
-        </w:numPr>
-      </w:pPr>
-      <w:r>
-        <w:t>Timeouts do not cause an uncertain transaction to be treated as failed or completed. </w:t>
-      </w:r>
-    </w:p>
-    <w:p>
-      <w:pPr>
-        <w:numPr>
-          <w:ilvl w:val="0"/>
-          <w:numId w:val="86"/>
-        </w:numPr>
-      </w:pPr>
-      <w:r>
-        <w:t>Multi-currency balances and reservations remain consistent. </w:t>
-      </w:r>
-    </w:p>
-    <w:p>
-      <w:pPr>
-        <w:numPr>
-          <w:ilvl w:val="0"/>
-          <w:numId w:val="87"/>
-        </w:numPr>
-      </w:pPr>
-      <w:r>
-        <w:t>The audit log reconstructs the full authorization and payment sequence. </w:t>
-      </w:r>
-    </w:p>
-    <w:p>
-      <w:pPr>
-        <w:numPr>
-          <w:ilvl w:val="0"/>
-          <w:numId w:val="88"/>
-        </w:numPr>
-      </w:pPr>
-      <w:r>
-        <w:t>Users understand that payment-habit indicators are not official credit scores. </w:t>
-      </w:r>
-    </w:p>
-    <w:p>
-      <w:pPr>
-        <w:numPr>
-          <w:ilvl w:val="0"/>
-          <w:numId w:val="89"/>
-        </w:numPr>
-      </w:pPr>
-      <w:r>
-        <w:t>At least one sandbox payment reaches a confirmed final state and produces a receipt. </w:t>
-      </w:r>
-    </w:p>
-    <w:p>
-      <w:r>
-        <w:lastRenderedPageBreak/>
-        <w:t>Savings, forecast accuracy, credit outcomes, and willingness to pay require evidence from actual testing. The first demonstration should prove that the core workflow works reliably, including at least one failure or recovery case, before expanding coverage. </w:t>
-      </w:r>
-    </w:p>
-    <w:p>
-      <w:r>
-        <w:t> </w:t>
-      </w:r>
-    </w:p>
-    <w:p/>
+      <w:pPr>
+        <w:pStyle w:val="a3"/>
+      </w:pPr>
+      <w:r>
+        <w:t>DOT AI 跨境汇款与个人财务助手</w:t>
+      </w:r>
+    </w:p>
+    <w:p>
+      <w:pPr>
+        <w:pStyle w:val="a5"/>
+      </w:pPr>
+      <w:r>
+        <w:t>NON on-chain 功能需求说明书</w:t>
+      </w:r>
+    </w:p>
+    <w:p>
+      <w:pPr>
+        <w:pStyle w:val="a5"/>
+      </w:pPr>
+      <w:r>
+        <w:t>版本 5.0 中文修订版    2026 年 10 月 20 日</w:t>
+      </w:r>
+    </w:p>
+    <w:p>
+      <w:r>
+        <w:t>本项目面向有跨币种生活、学习及汇款需求的用户，帮助用户理解汇率与费用、规划资金、准备银行转账资料，并管理日常开销和提醒。产品采用 NON on-chain 方向，不要求区块链钱包、链上交易或 AI 自主付款。</w:t>
+      </w:r>
+    </w:p>
+    <w:p>
+      <w:r>
+        <w:t>AI 的工作是理解请求、给出可检查的计划、调用信息与记录工具、解释结果。用户自行在银行或汇款机构完成实际支付。本地模拟支付用于展示流程和异常恢复，不能作为真实汇款证明。项目中的“执行”指查询、计算、创建待审核记录、生成资料和提醒等应用操作。</w:t>
+      </w:r>
+    </w:p>
+    <w:p>
+      <w:pPr>
+        <w:pStyle w:val="2"/>
+      </w:pPr>
+      <w:r>
+        <w:t>1 本次范围调整</w:t>
+      </w:r>
+    </w:p>
+    <w:p>
+      <w:pPr>
+        <w:spacing w:after="100"/>
+        <w:ind w:left="200" w:hanging="200"/>
+      </w:pPr>
+      <w:r>
+        <w:t>• 删除原需求中的 AI 支付权限分级、支付授权委托、自动扣款、自动换汇及自主资金执行目标。账户登录、数据访问控制和日志保护仍是软件安全要求。</w:t>
+      </w:r>
+    </w:p>
+    <w:p>
+      <w:pPr>
+        <w:spacing w:after="100"/>
+        <w:ind w:left="200" w:hanging="200"/>
+      </w:pPr>
+      <w:r>
+        <w:t>• 链上钱包、私钥托管、签名广播、Gas、链上限额和链上交易回执不纳入本版交付范围，也不作为功能缺失扣分项。</w:t>
+      </w:r>
+    </w:p>
+    <w:p>
+      <w:pPr>
+        <w:spacing w:after="100"/>
+        <w:ind w:left="200" w:hanging="200"/>
+      </w:pPr>
+      <w:r>
+        <w:t>• 将原先必须连接外部服务商沙箱的首发门槛，调整为信息分析与规划闭环；第三方沙箱接入成为可选扩展，本地模拟必须明确标注。</w:t>
+      </w:r>
+    </w:p>
+    <w:p>
+      <w:pPr>
+        <w:spacing w:after="100"/>
+        <w:ind w:left="200" w:hanging="200"/>
+      </w:pPr>
+      <w:r>
+        <w:t>• 将消费记账、学生理财、银行模板、汇率盯盘、成长激励及邮件报告纳入正式功能范围。</w:t>
+      </w:r>
+    </w:p>
+    <w:p>
+      <w:pPr>
+        <w:spacing w:after="100"/>
+        <w:ind w:left="200" w:hanging="200"/>
+      </w:pPr>
+      <w:r>
+        <w:t>• 将建议增加但尚未形成完整实现的能力列入独立需求清单，不与当前能力混写。</w:t>
+      </w:r>
+    </w:p>
+    <w:p>
+      <w:pPr>
+        <w:pStyle w:val="2"/>
+      </w:pPr>
+      <w:r>
+        <w:t>2 状态与验收口径</w:t>
+      </w:r>
+    </w:p>
+    <w:p>
+      <w:r>
+        <w:t>“已实现”表示当前代码存在相关功能；“待外部验收”表示仍需实际模型、行情、SMTP 等依赖验证；“本地模拟”表示不发生真实资金移动；“建议新增”表示尚未形成本文定义的完整闭环。代码实现和实际可用性分别验收。</w:t>
+      </w:r>
+    </w:p>
+    <w:p>
+      <w:r>
+        <w:t>当前工程检查基线为 15 个业务视图、40 个 Agent 工具及 163 项通过的 Python 测试。该结果来自 2026 年 10 月 20 日的前次检查，不能替代浏览器、外部服务或实际用户验收。本版需求替代 v4.0 的范围与优先级；既有评分报告依据旧范围计算，应另行重评，不沿用其自主付款扣分。</w:t>
+      </w:r>
+    </w:p>
+    <w:p>
+      <w:r>
+        <w:t>本文描述产品需求变更，不代表历史实现已经从代码仓库彻底清理。遗留支付授权和 EVM 实现须按第 9 节进行交付隔离或清理。本次只修订文档。</w:t>
+      </w:r>
+    </w:p>
+    <w:p>
+      <w:r>
+        <w:br w:type="page"/>
+      </w:r>
+    </w:p>
+    <w:p>
+      <w:pPr>
+        <w:pStyle w:val="1"/>
+      </w:pPr>
+      <w:r>
+        <w:t>3 用户问题与核心体验</w:t>
+      </w:r>
+    </w:p>
+    <w:p>
+      <w:pPr>
+        <w:pStyle w:val="2"/>
+      </w:pPr>
+      <w:r>
+        <w:t>3 1 用户与场景</w:t>
+      </w:r>
+    </w:p>
+    <w:p>
+      <w:r>
+        <w:t>目标用户包括向家人汇款的人、海外工作者、国际学生、自由职业者及需要跨币种生活规划的人。国籍、语言、居住地和汇款地区分别记录，不根据姓名或语言推断付款资格。</w:t>
+      </w:r>
+    </w:p>
+    <w:p>
+      <w:r>
+        <w:t>用户通常需要同时回答四个问题：现在换汇是否合适；扣除费用后预计能收到多少；这笔支出会不会影响房租或学费；应准备哪些银行资料。项目将这些问题连接到个人现金流和提醒，而不是连接到 AI 自动付款。</w:t>
+      </w:r>
+    </w:p>
+    <w:p>
+      <w:pPr>
+        <w:pStyle w:val="2"/>
+      </w:pPr>
+      <w:r>
+        <w:t>3 2 标准使用流程</w:t>
+      </w:r>
+    </w:p>
+    <w:p>
+      <w:r>
+        <w:t>1. 用户用自然语言说明金额、币种、用途及截止日期；系统追问缺失信息，显示所理解的需求。</w:t>
+      </w:r>
+    </w:p>
+    <w:p>
+      <w:r>
+        <w:t>2. 工具查询带来源和时间的参考汇率，计算历史位置、费用情景及资金缺口；不可用数据明确显示不可用。</w:t>
+      </w:r>
+    </w:p>
+    <w:p>
+      <w:r>
+        <w:t>3. 系统展示方案和假设，用户调整金额、时间、安全垫或目标；接受方案只保存计划，不扣款。</w:t>
+      </w:r>
+    </w:p>
+    <w:p>
+      <w:r>
+        <w:t>4. 系统生成待核对的银行资料和指令单，或创建汇率、学费及申请截止提醒。用户核对后自行前往银行渠道操作。</w:t>
+      </w:r>
+    </w:p>
+    <w:p>
+      <w:r>
+        <w:t>5. 用户继续记账和更新计划。未来的人工实际汇款记录应与模拟记录分开，详细要求见第 9 节。</w:t>
+      </w:r>
+    </w:p>
+    <w:p>
+      <w:pPr>
+        <w:pStyle w:val="2"/>
+      </w:pPr>
+      <w:r>
+        <w:t>3 3 必须区分的数据</w:t>
+      </w:r>
+    </w:p>
+    <w:p>
+      <w:pPr>
+        <w:spacing w:after="100"/>
+        <w:ind w:left="200" w:hanging="200"/>
+      </w:pPr>
+      <w:r>
+        <w:t>• 参考汇率是数据源提供的观察值，不是银行承诺成交价；日参考数据不得标成实时可成交价格。</w:t>
+      </w:r>
+    </w:p>
+    <w:p>
+      <w:pPr>
+        <w:spacing w:after="100"/>
+        <w:ind w:left="200" w:hanging="200"/>
+      </w:pPr>
+      <w:r>
+        <w:t>• 模拟方案和本地模拟报价用于比较与演示，不代表服务商已经提供报价或接受支付。</w:t>
+      </w:r>
+    </w:p>
+    <w:p>
+      <w:pPr>
+        <w:spacing w:after="100"/>
+        <w:ind w:left="200" w:hanging="200"/>
+      </w:pPr>
+      <w:r>
+        <w:t>• 用户自填现金及导入账单是规划依据，不证明银行当前可用余额；计划中的奖学金和收入不是已到账资金。</w:t>
+      </w:r>
+    </w:p>
+    <w:p>
+      <w:pPr>
+        <w:spacing w:after="100"/>
+        <w:ind w:left="200" w:hanging="200"/>
+      </w:pPr>
+      <w:r>
+        <w:t>• 预测、情景计算、内部习惯指标和模型解释各有标签，不得呈现为保证收益、官方信用评分或已发生交易。</w:t>
+      </w:r>
+    </w:p>
+    <w:p>
+      <w:pPr>
+        <w:pStyle w:val="2"/>
+      </w:pPr>
+      <w:r>
+        <w:t>3 4 产品价值验证</w:t>
+      </w:r>
+    </w:p>
+    <w:p>
+      <w:r>
+        <w:t>用户应能看懂净到账金额的计算依据，识别计划的资金缺口，找到所需转账资料，并知道下一步需要由自己完成什么。评估记录任务完成率、金额与币种错误、来源理解、提醒有效性和用户反馈；节省费用或改善习惯的效果需由实际使用证据支持。</w:t>
+      </w:r>
+    </w:p>
+    <w:p>
+      <w:r>
+        <w:br w:type="page"/>
+      </w:r>
+    </w:p>
+    <w:p>
+      <w:pPr>
+        <w:pStyle w:val="1"/>
+      </w:pPr>
+      <w:r>
+        <w:t>4 汇率分析与汇款规划</w:t>
+      </w:r>
+    </w:p>
+    <w:p>
+      <w:r>
+        <w:t>本节承接原 4.1—4.6 模块。除明确标为建议新增的内容外，以下能力已有代码实现；外部数据可用性须单独验收。</w:t>
+      </w:r>
+    </w:p>
+    <w:p>
+      <w:pPr>
+        <w:pStyle w:val="2"/>
+      </w:pPr>
+      <w:r>
+        <w:t>FR01 资金与汇款需求</w:t>
+      </w:r>
+    </w:p>
+    <w:p>
+      <w:r>
+        <w:t>记录持有币种、发送及接收地区、金额、用途、收款对象、语言和期望日期。支持固定发送额及在费用模型支持时反算目标接收额。对币种、金额、日期或对象不明确的请求先追问。示例：“我需要在月底前准备 5,000 元人民币，帮我比较澳元换汇方案，并计算学费后的余额。”</w:t>
+      </w:r>
+    </w:p>
+    <w:p>
+      <w:r>
+        <w:t>验收：同一请求在聊天与表单中形成一致的结构化信息；缺少关键字段时不生成看似完整的转账指令。</w:t>
+      </w:r>
+    </w:p>
+    <w:p>
+      <w:pPr>
+        <w:pStyle w:val="2"/>
+      </w:pPr>
+      <w:r>
+        <w:t>FR02 地区与路线配置</w:t>
+      </w:r>
+    </w:p>
+    <w:p>
+      <w:r>
+        <w:t>提供地区、币种、语言和路线能力配置，优先展示 APEC 相关场景。参考查询、历史数据、模拟比较与本地模拟支付分别标记。启用地区模板不表示银行或汇款机构支持该地区。</w:t>
+      </w:r>
+    </w:p>
+    <w:p>
+      <w:r>
+        <w:t>验收：禁用或不支持的路线明确说明原因，不能因模板存在就宣称可真实汇款。</w:t>
+      </w:r>
+    </w:p>
+    <w:p>
+      <w:pPr>
+        <w:pStyle w:val="2"/>
+      </w:pPr>
+      <w:r>
+        <w:t>FR03 最新参考汇率</w:t>
+      </w:r>
+    </w:p>
+    <w:p>
+      <w:r>
+        <w:t>展示数据源、报价方向、观察时间和更新频率。现有来源包括 ECB 及明确标注的 Frankfurter 回退数据；经共同基准币推导的汇率需标明推导关系。来源失败不伪造真实数据。</w:t>
+      </w:r>
+    </w:p>
+    <w:p>
+      <w:r>
+        <w:t>验收：用户能区分观察时间与查询时间；切换方向后计算一致；模拟测试值不得混入真实行情标签。</w:t>
+      </w:r>
+    </w:p>
+    <w:p>
+      <w:pPr>
+        <w:pStyle w:val="2"/>
+      </w:pPr>
+      <w:r>
+        <w:t>FR04 历史分析</w:t>
+      </w:r>
+    </w:p>
+    <w:p>
+      <w:r>
+        <w:t>支持 30 天、90 天和一年等窗口，展示趋势、最小值、最大值、均值、分位和数据覆盖。解释与换汇方向绑定，历史高位不等于未来上涨概率。</w:t>
+      </w:r>
+    </w:p>
+    <w:p>
+      <w:r>
+        <w:t>验收：稀疏数据和缺失交易日有说明；历史不可用不阻断用户保存计划。</w:t>
+      </w:r>
+    </w:p>
+    <w:p>
+      <w:pPr>
+        <w:pStyle w:val="2"/>
+      </w:pPr>
+      <w:r>
+        <w:t>FR05 实验预测与情景计算</w:t>
+      </w:r>
+    </w:p>
+    <w:p>
+      <w:r>
+        <w:t>已有实验性 7 天预测、历史回测误差、与不变汇率基线的比较及区间信息；数据不足时停止输出。30 天预测仍为后续候选功能。情景计算独立展示，例如汇率不利变化 3% 对资金缺口的影响。</w:t>
+      </w:r>
+    </w:p>
+    <w:p>
+      <w:r>
+        <w:t>验收：显示数据截止日、预测期限及评估依据；模型不能补写缺失预测值，预测区间不应解释为收益保证。</w:t>
+      </w:r>
+    </w:p>
+    <w:p>
+      <w:pPr>
+        <w:pStyle w:val="2"/>
+      </w:pPr>
+      <w:r>
+        <w:t>FR06 方案与总成本比较</w:t>
+      </w:r>
+    </w:p>
+    <w:p>
+      <w:r>
+        <w:t>比较固定费、比例费、适用汇率、价差、预计接收额与时效，可按接收额或速度排序。当前存在参考计算、模拟选项与本地模拟报价，尚未接入经验证的外部可成交报价。未知中转行或收款行费用必须提示。</w:t>
+      </w:r>
+    </w:p>
+    <w:p>
+      <w:r>
+        <w:t>验收：费用计算可复核；方案来源清楚；用户可从方案继续到目标规划或模板资料准备。</w:t>
+      </w:r>
+    </w:p>
+    <w:p>
+      <w:r>
+        <w:br w:type="page"/>
+      </w:r>
+    </w:p>
+    <w:p>
+      <w:pPr>
+        <w:pStyle w:val="1"/>
+      </w:pPr>
+      <w:r>
+        <w:t>5 资金记录与本地演示</w:t>
+      </w:r>
+    </w:p>
+    <w:p>
+      <w:r>
+        <w:t>本节修订原 4.7、4.8、4.10—4.13。原支付权限分级取消；应用数据校验、用户核对和审计保留。</w:t>
+      </w:r>
+    </w:p>
+    <w:p>
+      <w:pPr>
+        <w:pStyle w:val="2"/>
+      </w:pPr>
+      <w:r>
+        <w:t>FR07 多币种资金记录</w:t>
+      </w:r>
+    </w:p>
+    <w:p>
+      <w:r>
+        <w:t>分别展示每币种记录余额、可用值和本地模拟中的预留资金。参考等值须附汇率来源，不直接相加不同币种。用户自填资金与模拟账本独立标记；自填资金不是系统托管钱包。</w:t>
+      </w:r>
+    </w:p>
+    <w:p>
+      <w:r>
+        <w:t>验收：模拟充值或模拟交易不能被显示成真实银行资产变化；同一资产不得因账单导入与手工填写被无提示地重复计入。</w:t>
+      </w:r>
+    </w:p>
+    <w:p>
+      <w:pPr>
+        <w:pStyle w:val="2"/>
+      </w:pPr>
+      <w:r>
+        <w:t>FR08 目标与预算</w:t>
+      </w:r>
+    </w:p>
+    <w:p>
+      <w:r>
+        <w:t>记录目标金额、币种、用途和期限，支持收入、开销、安全垫及一次性或分期情景。展示缺口、所需准备金额及时间安排。接受或修改计划只改变规划数据。</w:t>
+      </w:r>
+    </w:p>
+    <w:p>
+      <w:r>
+        <w:t>验收：已确认支出、未来预计支出与模拟付款有清楚的数据口径；所有推算说明汇率和收入假设。</w:t>
+      </w:r>
+    </w:p>
+    <w:p>
+      <w:pPr>
+        <w:pStyle w:val="2"/>
+      </w:pPr>
+      <w:r>
+        <w:t>FR09 输入与结果校验</w:t>
+      </w:r>
+    </w:p>
+    <w:p>
+      <w:r>
+        <w:t>用后端规则检查金额、币种、日期、必填字段、支持路线和银行字段格式；记录类操作保留审核过程。模型输出及导入文件均视为待校验输入。用户确认模板信息属于资料核对，不是向 AI 授予扣款权。</w:t>
+      </w:r>
+    </w:p>
+    <w:p>
+      <w:r>
+        <w:t>验收：非法金额被拒绝；待审核内容可修改；聊天中的“好的”不构成付款指令。系统不提供 AI 支付授权等级、自动扣款委托或自行提高限额的产品入口。</w:t>
+      </w:r>
+    </w:p>
+    <w:p>
+      <w:pPr>
+        <w:pStyle w:val="2"/>
+      </w:pPr>
+      <w:r>
+        <w:t>FR10 本地模拟支付</w:t>
+      </w:r>
+    </w:p>
+    <w:p>
+      <w:r>
+        <w:t>当前实现保留草稿、用户操作、提交、处理中、未知、完成及失败等演示状态，以及幂等、资金预留和对账逻辑。仅用于演示应用如何处理重复请求和不确定结果，不作为本版核心成功标准。</w:t>
+      </w:r>
+    </w:p>
+    <w:p>
+      <w:r>
+        <w:t>验收：页面、记录和回执均标明本地模拟；未知结果不能直接当作失败重付；终态只能结算一次。任何用户按钮只能操作模拟账本，不应被理解为授权 AI 实际付款。旧版演示里的授权步骤不再是本版 AI 功能要求。</w:t>
+      </w:r>
+    </w:p>
+    <w:p>
+      <w:pPr>
+        <w:pStyle w:val="2"/>
+      </w:pPr>
+      <w:r>
+        <w:t>FR11 决策记录与历史</w:t>
+      </w:r>
+    </w:p>
+    <w:p>
+      <w:r>
+        <w:t>区分接受建议、确认资料、修改计划和本地模拟操作。保留对应版本、时间及结果；修改金额或收款资料后重新标为待核对。历史数据不因今日汇率变化而被重写。</w:t>
+      </w:r>
+    </w:p>
+    <w:p>
+      <w:r>
+        <w:t>验收：用户能看出“计划”“模拟完成”与未来的“用户记录实际完成”之间的区别。</w:t>
+      </w:r>
+    </w:p>
+    <w:p>
+      <w:pPr>
+        <w:pStyle w:val="2"/>
+      </w:pPr>
+      <w:r>
+        <w:t>FR12 审计日志</w:t>
+      </w:r>
+    </w:p>
+    <w:p>
+      <w:r>
+        <w:t>记录请求、工具、关键修改、校验、错误恢复及关联标识；敏感字段脱敏，不记录凭据。现有审计通过应用层追加及数据库限制保护，不宣称密码学不可篡改。</w:t>
+      </w:r>
+    </w:p>
+    <w:p>
+      <w:r>
+        <w:t>验收：可以还原一条需求从理解、计算、资料准备到保存结果的过程；审计访问与普通数据访问均受应用控制。</w:t>
+      </w:r>
+    </w:p>
+    <w:p>
+      <w:r>
+        <w:br w:type="page"/>
+      </w:r>
+    </w:p>
+    <w:p>
+      <w:pPr>
+        <w:pStyle w:val="1"/>
+      </w:pPr>
+      <w:r>
+        <w:t>6 AI 工具与记忆</w:t>
+      </w:r>
+    </w:p>
+    <w:p>
+      <w:r>
+        <w:t>本节扩充原 4.9。当前为单一 Agent 编排器结合规则回退及业务工具，并非已实现多个独立 Agent 相互协作。</w:t>
+      </w:r>
+    </w:p>
+    <w:p>
+      <w:pPr>
+        <w:pStyle w:val="2"/>
+      </w:pPr>
+      <w:r>
+        <w:t>FR13 可检查的规划过程</w:t>
+      </w:r>
+    </w:p>
+    <w:p>
+      <w:r>
+        <w:t>系统先记录意图、金额币种、缺失字段和计划步骤，再调用白名单工具。前端通过 SSE 展示阶段、工具和结果事件。这是工作进度可视化，不意味着暴露模型内部推理，也不等于逐字生成流。</w:t>
+      </w:r>
+    </w:p>
+    <w:p>
+      <w:r>
+        <w:t>已配置支持工具调用的兼容模型时进行模型编排；未配置时使用规则规划器并明确标注规则模式。模型调用失败应给出可理解的状态，不伪装成成功。</w:t>
+      </w:r>
+    </w:p>
+    <w:p>
+      <w:pPr>
+        <w:pStyle w:val="2"/>
+      </w:pPr>
+      <w:r>
+        <w:t>FR14 业务工具</w:t>
+      </w:r>
+    </w:p>
+    <w:p>
+      <w:r>
+        <w:t>当前 40 个工具涵盖汇率查询、历史分析、实验预测、方案比较、余额与目标查询、现金流、支出记录、奖学金、模板草拟、盯盘、提醒及记忆等。金额计算和业务规则由程序处理，模型负责选择工具及说明结果。</w:t>
+      </w:r>
+    </w:p>
+    <w:p>
+      <w:r>
+        <w:t>代表工具包括 latest_rate、rate_history、compare_options、cashflow_plan、afford_check、log_expense、draft_transfer_template、watch_exchange 和 recall_memory。prepare_payment 等历史名称对应本地模拟草稿，不代表真实支付工具。产品交付应避免此类名称误导用户。</w:t>
+      </w:r>
+    </w:p>
+    <w:p>
+      <w:r>
+        <w:t>边界：不向 AI 提供付款批准、真实提交、自动换汇或扣款工具。资料与账目写入按各模块的审核规则处理；邮件发送属于可选通知能力，须受收件地址与通知设置约束。</w:t>
+      </w:r>
+    </w:p>
+    <w:p>
+      <w:pPr>
+        <w:pStyle w:val="2"/>
+      </w:pPr>
+      <w:r>
+        <w:t>FR15 三层记忆</w:t>
+      </w:r>
+    </w:p>
+    <w:p>
+      <w:r>
+        <w:t>短期对话保存最近上下文；长期笔记记录偏好、人物与习惯；经历记录保存任务及工具结果。当前近期上下文默认取 12 条消息，长期有效笔记上限 200 条、单条 3—300 字符。检索使用词匹配及中日韩字符组合，不是向量语义检索。</w:t>
+      </w:r>
+    </w:p>
+    <w:p>
+      <w:r>
+        <w:t>用户可以查看和遗忘笔记。现有遗忘主要将笔记标为失效，不等于同时物理删除对话、经历及备份；完整删除属于建议新增要求。记忆不能替代当前行情、账本或已确认模板作为事实来源。</w:t>
+      </w:r>
+    </w:p>
+    <w:p>
+      <w:pPr>
+        <w:pStyle w:val="2"/>
+      </w:pPr>
+      <w:r>
+        <w:t>验收场景</w:t>
+      </w:r>
+    </w:p>
+    <w:p>
+      <w:pPr>
+        <w:spacing w:after="100"/>
+        <w:ind w:left="200" w:hanging="200"/>
+      </w:pPr>
+      <w:r>
+        <w:t>• 用户说“下月要交学费”，系统补问币种、金额及日期，并调用现金流工具而非猜测余额。</w:t>
+      </w:r>
+    </w:p>
+    <w:p>
+      <w:pPr>
+        <w:spacing w:after="100"/>
+        <w:ind w:left="200" w:hanging="200"/>
+      </w:pPr>
+      <w:r>
+        <w:t>• CSV、小票或工具结果含有“忽略规则”“自动付款”等文字时，仍作为数据处理，不能扩大工具能力。</w:t>
+      </w:r>
+    </w:p>
+    <w:p>
+      <w:pPr>
+        <w:spacing w:after="100"/>
+        <w:ind w:left="200" w:hanging="200"/>
+      </w:pPr>
+      <w:r>
+        <w:t>• 未配置模型时明确标识规则模式；查询失败时不生成虚构报价。</w:t>
+      </w:r>
+    </w:p>
+    <w:p>
+      <w:pPr>
+        <w:spacing w:after="100"/>
+        <w:ind w:left="200" w:hanging="200"/>
+      </w:pPr>
+      <w:r>
+        <w:t>• 用户修改偏好后后续回答采用新值；遗忘操作显示实际作用范围。</w:t>
+      </w:r>
+    </w:p>
+    <w:p>
+      <w:r>
+        <w:t>多 Agent 分工可作为后续架构实验，但不是当前交付要求。是否采用取决于任务质量、延迟和可维护性测试，不以 Agent 数量衡量完成度。</w:t>
+      </w:r>
+    </w:p>
+    <w:p>
+      <w:r>
+        <w:br w:type="page"/>
+      </w:r>
+    </w:p>
+    <w:p>
+      <w:pPr>
+        <w:pStyle w:val="1"/>
+      </w:pPr>
+      <w:r>
+        <w:t>7 新增个人财务与学生功能</w:t>
+      </w:r>
+    </w:p>
+    <w:p>
+      <w:r>
+        <w:t>以下功能从辅助演示扩充为正式产品模块。已有代码不等于外部服务已经验收。</w:t>
+      </w:r>
+    </w:p>
+    <w:p>
+      <w:pPr>
+        <w:pStyle w:val="2"/>
+      </w:pPr>
+      <w:r>
+        <w:t>FR16 消费记账与审核</w:t>
+      </w:r>
+    </w:p>
+    <w:p>
+      <w:r>
+        <w:t>支持银行 CSV 导入、文字快速记账、商家分类建议、疑似重复标记、批量审核、修改删除、周期预计开销及消费统计。语音输入依赖浏览器能力。导入和 AI 创建的支出先进入审核队列。</w:t>
+      </w:r>
+    </w:p>
+    <w:p>
+      <w:r>
+        <w:t>验收：保留原始金额和币种；预计条目与已确认支出区分；重复导入能提示疑似重复，用户能纠正分类。银行自动同步不属于已实现能力。</w:t>
+      </w:r>
+    </w:p>
+    <w:p>
+      <w:pPr>
+        <w:pStyle w:val="2"/>
+      </w:pPr>
+      <w:r>
+        <w:t>FR17 小票识别</w:t>
+      </w:r>
+    </w:p>
+    <w:p>
+      <w:r>
+        <w:t>通过视觉模型提取小票信息，用户检查后保存。该能力需要支持图像的外部模型；未配置时说明不可用。识别结果不是银行交易证明。</w:t>
+      </w:r>
+    </w:p>
+    <w:p>
+      <w:r>
+        <w:t>验收：用户可改日期、商家、币种和金额；失败图片不得生成确定支出；跨语言、模糊图片及错误币种的实际识别质量仍需专项验收。</w:t>
+      </w:r>
+    </w:p>
+    <w:p>
+      <w:pPr>
+        <w:pStyle w:val="2"/>
+      </w:pPr>
+      <w:r>
+        <w:t>FR18 自填现金与资金需求</w:t>
+      </w:r>
+    </w:p>
+    <w:p>
+      <w:r>
+        <w:t>记录用户持有资金、来源、币种和换汇需求，展示参考换算及目标缺口。资金来源区分手工输入、已确认记录与模拟账本。</w:t>
+      </w:r>
+    </w:p>
+    <w:p>
+      <w:r>
+        <w:t>验收：用户可追溯计算采用哪些资金；界面不将自填数字称为银行验证余额。独立资产去重与完整对账见建议新增需求。</w:t>
+      </w:r>
+    </w:p>
+    <w:p>
+      <w:pPr>
+        <w:pStyle w:val="2"/>
+      </w:pPr>
+      <w:r>
+        <w:t>FR19 学期现金流与支出承受判断</w:t>
+      </w:r>
+    </w:p>
+    <w:p>
+      <w:r>
+        <w:t>记录学期、学费及截止日、生活费、收入和安全垫，估算月末余额、最低点和首次缺口。“买得起吗”对比购买前后的资金走势与必要支出，说明可承担程度及假设。</w:t>
+      </w:r>
+    </w:p>
+    <w:p>
+      <w:r>
+        <w:t>验收：结果能复算；收入时点与学费日期影响资金缺口；用户能看到缺失输入。此功能不审批贷款，不保证未来偿付能力。</w:t>
+      </w:r>
+    </w:p>
+    <w:p>
+      <w:pPr>
+        <w:pStyle w:val="2"/>
+      </w:pPr>
+      <w:r>
+        <w:t>FR20 奖学金与助学金跟踪</w:t>
+      </w:r>
+    </w:p>
+    <w:p>
+      <w:r>
+        <w:t>记录了解、准备、申请、获得等状态及日期、材料清单，提供材料和截止提醒。已获得的奖学金按设置的发放时间进入预测；实际到账仍需用户核对。</w:t>
+      </w:r>
+    </w:p>
+    <w:p>
+      <w:r>
+        <w:t>验收：未获批收入不被默认当成已到账现金；能修改截止日期与材料；系统不自动向外部机构提交申请，也不保证获得资助。</w:t>
+      </w:r>
+    </w:p>
+    <w:p>
+      <w:pPr>
+        <w:pStyle w:val="2"/>
+      </w:pPr>
+      <w:r>
+        <w:t>FR21 消费洞察与邮件报告</w:t>
+      </w:r>
+    </w:p>
+    <w:p>
+      <w:r>
+        <w:t>比较近期与上一期消费，展示分类变化、订阅、频繁小额开销、预算与学费缺口。支持周月报告预览和 SMTP 邮件适配。实际投递依赖有效配置与外部验收。</w:t>
+      </w:r>
+    </w:p>
+    <w:p>
+      <w:r>
+        <w:t>验收：洞察引用具体金额和时间窗；用户可控制通知；未配置 SMTP 仍能看预览，不宣称已经送达。持久重试和投递追踪属于后续需求。</w:t>
+      </w:r>
+    </w:p>
+    <w:p>
+      <w:r>
+        <w:br w:type="page"/>
+      </w:r>
+    </w:p>
+    <w:p>
+      <w:pPr>
+        <w:pStyle w:val="1"/>
+      </w:pPr>
+      <w:r>
+        <w:t>8 银行资料与日常支持</w:t>
+      </w:r>
+    </w:p>
+    <w:p>
+      <w:pPr>
+        <w:pStyle w:val="2"/>
+      </w:pPr>
+      <w:r>
+        <w:t>FR22 银行转账模板</w:t>
+      </w:r>
+    </w:p>
+    <w:p>
+      <w:r>
+        <w:t>支持 SWIFT、SEPA、BSB、FPS、ACH、CNAPS 和 NEFT 等字段模板及对应格式校验，保存用户确认状态，生成可复制的转账资料和文本指令。SWIFT 的 MT103 内容仅为字段预览，由实际银行生成并发送正式报文。</w:t>
+      </w:r>
+    </w:p>
+    <w:p>
+      <w:r>
+        <w:t>AI 起草或银行字段变更后，模板保持待核实；用户应对照可信来源核对信息。格式通过不等于账号存在、账户归属正确或收款人可信。系统不向银行发送转账指令。</w:t>
+      </w:r>
+    </w:p>
+    <w:p>
+      <w:r>
+        <w:t>验收：未核实及变更状态明显；完整账户信息只在必要的受保护资料视图展示；复制及下载内容准确标明用途。独立收款人验证与防诈骗闭环属于后续扩展。</w:t>
+      </w:r>
+    </w:p>
+    <w:p>
+      <w:pPr>
+        <w:pStyle w:val="2"/>
+      </w:pPr>
+      <w:r>
+        <w:t>FR23 汇率盯盘</w:t>
+      </w:r>
+    </w:p>
+    <w:p>
+      <w:r>
+        <w:t>根据历史位置、均值偏离、近期走势、实验预测、最低接受汇率和截止日期产生判断与提醒。可使用规则及模型解释。低于用户底线不能称为好时机，临近截止不能只建议继续等待。</w:t>
+      </w:r>
+    </w:p>
+    <w:p>
+      <w:r>
+        <w:t>验收：结论带数据时间及理由；没有新数据时避免反复发送相同提醒；“把握程度”不是经过校准的获利概率。盯盘只提醒，不自动换汇。持久去重、漏发追踪和跨重启恢复仍需增强。</w:t>
+      </w:r>
+    </w:p>
+    <w:p>
+      <w:pPr>
+        <w:pStyle w:val="2"/>
+      </w:pPr>
+      <w:r>
+        <w:t>FR24 付款习惯与信用教育</w:t>
+      </w:r>
+    </w:p>
+    <w:p>
+      <w:r>
+        <w:t>提供义务到期、付款记录、内部一致性指标和教育说明，承接原 4.14。模拟支付不建立真实信用历史，不承诺汇款能够改善信用评分，也不表示已向征信机构报送。</w:t>
+      </w:r>
+    </w:p>
+    <w:p>
+      <w:r>
+        <w:t>验收：内部指标和用户自报记录均有标签，用户能够区分教育内容与正式信用评估。</w:t>
+      </w:r>
+    </w:p>
+    <w:p>
+      <w:pPr>
+        <w:pStyle w:val="2"/>
+      </w:pPr>
+      <w:r>
+        <w:t>FR25 提醒与成长激励</w:t>
+      </w:r>
+    </w:p>
+    <w:p>
+      <w:r>
+        <w:t>提醒覆盖付款期限、目标汇率、资金缺口、学费、奖学金材料及本地模拟异常。成长包含徽章、宽容连续记录、可选挑战、等级与庆祝开关。等级反映应用中的技能或习惯，不评价资产规模和信用资质。</w:t>
+      </w:r>
+    </w:p>
+    <w:p>
+      <w:r>
+        <w:t>验收：用户可关闭激励和动效；挑战结束不惩罚用户；未完成支付不能因庆祝动画而显示为已付款。</w:t>
+      </w:r>
+    </w:p>
+    <w:p>
+      <w:pPr>
+        <w:pStyle w:val="2"/>
+      </w:pPr>
+      <w:r>
+        <w:t>FR26 可视化与语言</w:t>
+      </w:r>
+    </w:p>
+    <w:p>
+      <w:r>
+        <w:t>当前 15 个视图覆盖总览、AI、汇款规划、模板、记账、支付演示、汇率、目标、学生理财、成长、习惯、资金、记忆、路线和审计。采用黑白点线圆设计，提供图表、阶段反馈、深色模式和减少动画支持。</w:t>
+      </w:r>
+    </w:p>
+    <w:p>
+      <w:r>
+        <w:t>现有六套语言为英语、简体中文、繁体中文、越南语、日语、韩语。六语言全量内容回归、键盘与屏幕阅读器验收尚需补齐；语言文件存在不表示所有文案均已通过本地化评审。</w:t>
+      </w:r>
+    </w:p>
+    <w:p>
+      <w:r>
+        <w:br w:type="page"/>
+      </w:r>
+    </w:p>
+    <w:p>
+      <w:pPr>
+        <w:pStyle w:val="1"/>
+      </w:pPr>
+      <w:r>
+        <w:t>9 建议新增的优先需求</w:t>
+      </w:r>
+    </w:p>
+    <w:p>
+      <w:r>
+        <w:t>下列条目尚未形成这里定义的完整交付闭环。它们是面向 NON on-chain 产品的建议，不要求恢复 AI 支付权限或链上支付。</w:t>
+      </w:r>
+    </w:p>
+    <w:p>
+      <w:pPr>
+        <w:pStyle w:val="2"/>
+      </w:pPr>
+      <w:r>
+        <w:t>N01 清理旧支付范围    P0</w:t>
+      </w:r>
+    </w:p>
+    <w:p>
+      <w:r>
+        <w:t>问题：旧文档、页面术语和历史代码可能使评委误解为托管或自动支付产品。要求：竞赛部署只开放信息、记录、规划、资料及明确的模拟演示；移除或隔离 EVM 配置与真实支付路径；删除 AI 支付授权产品入口，统一钱包和授权用语。</w:t>
+      </w:r>
+    </w:p>
+    <w:p>
+      <w:r>
+        <w:t>验收：竞赛构建无法调用真实支付路径；工具列表无资金执行接口； README、页面、演示脚本和本说明一致。此项是交付清理，不表示当前遗留代码已全部删除。</w:t>
+      </w:r>
+    </w:p>
+    <w:p>
+      <w:pPr>
+        <w:pStyle w:val="2"/>
+      </w:pPr>
+      <w:r>
+        <w:t>N02 人工实际汇款档案    P0</w:t>
+      </w:r>
+    </w:p>
+    <w:p>
+      <w:r>
+        <w:t>问题：用户离开应用完成银行支付后，规划缺少可靠的后续记录。要求：用户手工登记渠道、发送额、实际费用、到账额、时间、参考号及状态，可关联原计划并上传已脱敏凭证。记录标为用户提供，不能自动升级为银行验证事实。</w:t>
+      </w:r>
+    </w:p>
+    <w:p>
+      <w:r>
+        <w:t>验收：规划、模拟、用户记录实际汇款互不混淆；实际金额覆盖估算时保留版本；重复登记提示；无真实银行凭证或回执不能称为系统验证完成。</w:t>
+      </w:r>
+    </w:p>
+    <w:p>
+      <w:pPr>
+        <w:pStyle w:val="2"/>
+      </w:pPr>
+      <w:r>
+        <w:t>N03 资产与账单核对    P0</w:t>
+      </w:r>
+    </w:p>
+    <w:p>
+      <w:r>
+        <w:t>问题：手工现金、导入账单、计划和模拟余额可能重复计入。要求：建立账户来源、期初余额和对账周期；将本人账户间转账匹配为内部移动，支持拆分费用和标记未匹配条目。</w:t>
+      </w:r>
+    </w:p>
+    <w:p>
+      <w:r>
+        <w:t>验收：同一份账单重复导入不重复入账；内部转账不重复算作消费和收入；展示核对差额并让用户选择处理方式。现有疑似重复提示不等于完整对账。</w:t>
+      </w:r>
+    </w:p>
+    <w:p>
+      <w:pPr>
+        <w:pStyle w:val="2"/>
+      </w:pPr>
+      <w:r>
+        <w:t>N04 完整隐私与删除    P0</w:t>
+      </w:r>
+    </w:p>
+    <w:p>
+      <w:r>
+        <w:t>问题：记忆软遗忘不能覆盖所有数据副本。要求：让用户导出自身数据、选择保留期限、删除对话与笔记及关联附件，并说明审计和备份的保留边界；记账图片和模型请求说明传输范围。</w:t>
+      </w:r>
+    </w:p>
+    <w:p>
+      <w:r>
+        <w:t>验收：删除范围可预览，执行有结果；删除后不再参与检索；备份到期策略可验证；导出与删除不能访问其他用户数据。</w:t>
+      </w:r>
+    </w:p>
+    <w:p>
+      <w:pPr>
+        <w:pStyle w:val="2"/>
+      </w:pPr>
+      <w:r>
+        <w:t>N05 防诈骗核对流程    P1</w:t>
+      </w:r>
+    </w:p>
+    <w:p>
+      <w:r>
+        <w:t>要求：模板中收款信息变更时突出显示差异，提供独立渠道复核清单，并可保存核对时间与依据。银行格式检查与身份真实性分开展示。</w:t>
+      </w:r>
+    </w:p>
+    <w:p>
+      <w:r>
+        <w:t>验收：格式合法但未核实的账号仍显示未核实；用户不能因模型一句“安全”跳过核对。可选外部账户核验仅在有合适服务及证据时增加。</w:t>
+      </w:r>
+    </w:p>
+    <w:p>
+      <w:r>
+        <w:t>优先级定义：P0 为竞赛交付范围和关键数据可信性；P1 为可靠试用体验；P2 为证据充分后再扩展。是否全部纳入本次开发，应按实际时间安排，不将建议自动标为承诺交付。</w:t>
+      </w:r>
+    </w:p>
+    <w:p>
+      <w:r>
+        <w:br w:type="page"/>
+      </w:r>
+    </w:p>
+    <w:p>
+      <w:pPr>
+        <w:pStyle w:val="1"/>
+      </w:pPr>
+      <w:r>
+        <w:t>10 后续可靠性与体验要求</w:t>
+      </w:r>
+    </w:p>
+    <w:p>
+      <w:pPr>
+        <w:pStyle w:val="2"/>
+      </w:pPr>
+      <w:r>
+        <w:t>N06 通知可靠性    P1</w:t>
+      </w:r>
+    </w:p>
+    <w:p>
+      <w:r>
+        <w:t>将进程内提醒升级为持久任务队列，保存预定时间、时区、发送状态、重试次数及失败原因；按事件去重，支持静默时间和取消订阅。用户应能查看最近提醒与失败原因。</w:t>
+      </w:r>
+    </w:p>
+    <w:p>
+      <w:r>
+        <w:t>验收：重启后未发送任务仍存在；同一事件不重复发信；SMTP 拒绝、网络中断和时区变化有测试；“已排队”“已发送”“已送达”不混用。</w:t>
+      </w:r>
+    </w:p>
+    <w:p>
+      <w:pPr>
+        <w:pStyle w:val="2"/>
+      </w:pPr>
+      <w:r>
+        <w:t>N07 数据新鲜度与来源追溯    P1</w:t>
+      </w:r>
+    </w:p>
+    <w:p>
+      <w:r>
+        <w:t>现有来源标签基础上，统一记录查询及观察时间、推导路径、回退原因和过期状态；显示同一来源下的计算依据。不同来源口径差异不得被误认为市场波动。</w:t>
+      </w:r>
+    </w:p>
+    <w:p>
+      <w:r>
+        <w:t>验收：来源中断时显示上次数据时间；过期值不生成误导性“当前好时机”；用户能复核一条结论采用的数据和费用假设。</w:t>
+      </w:r>
+    </w:p>
+    <w:p>
+      <w:pPr>
+        <w:pStyle w:val="2"/>
+      </w:pPr>
+      <w:r>
+        <w:t>N08 模型质量与攻击防护评测    P1</w:t>
+      </w:r>
+    </w:p>
+    <w:p>
+      <w:r>
+        <w:t>建立覆盖六语言、歧义日期、不同货币小数位、导入文件提示注入、错误工具参数及来源失败的评测集；记录模型版本、工具正确率、费用和响应时间。现有工具白名单与单元测试作为基础，不视为完整评测。</w:t>
+      </w:r>
+    </w:p>
+    <w:p>
+      <w:r>
+        <w:t>验收：自动评分与人工抽检并存；错误请求不会生成真实支付操作；关键数字由工具生成且可追溯；模型不可用时可继续使用基础规划功能。</w:t>
+      </w:r>
+    </w:p>
+    <w:p>
+      <w:pPr>
+        <w:pStyle w:val="2"/>
+      </w:pPr>
+      <w:r>
+        <w:t>N09 多用户与可恢复部署    P1</w:t>
+      </w:r>
+    </w:p>
+    <w:p>
+      <w:r>
+        <w:t>现有单用户原型扩展前，增加账户隔离、会话管理、访问限流、敏感配置保护，以及数据库加密备份和恢复演练。认证与数据隔离属于软件安全，不恢复 AI 资金授权等级。</w:t>
+      </w:r>
+    </w:p>
+    <w:p>
+      <w:r>
+        <w:t>验收：跨账户请求被阻止；能从备份恢复计划、记账与提醒；对日志脱敏、会话过期和数据恢复执行专项测试。</w:t>
+      </w:r>
+    </w:p>
+    <w:p>
+      <w:pPr>
+        <w:pStyle w:val="2"/>
+      </w:pPr>
+      <w:r>
+        <w:t>N10 可访问性与完整语言验收    P1</w:t>
+      </w:r>
+    </w:p>
+    <w:p>
+      <w:r>
+        <w:t>为图表提供文本等价、键盘路径和焦点说明；点线圆不能成为唯一状态线索。检查移动端、缩放、减少动画、屏幕阅读器及六语言长文本。</w:t>
+      </w:r>
+    </w:p>
+    <w:p>
+      <w:r>
+        <w:t>验收：仅使用键盘可以完成查询、记账审核和模板核对；所有关键错误有文本；字体放大后金额与按钮不被截断。</w:t>
+      </w:r>
+    </w:p>
+    <w:p>
+      <w:pPr>
+        <w:pStyle w:val="2"/>
+      </w:pPr>
+      <w:r>
+        <w:t>N11 外部信息与分析扩展    P2</w:t>
+      </w:r>
+    </w:p>
+    <w:p>
+      <w:r>
+        <w:t>可选增加独立服务商费用信息、开放银行只读导入、更多汇率来源及经过评价的 30 天预测。每项都要求明确服务范围、数据授权、时效和故障处理。外部服务商沙箱仅作为独立演示扩展，不恢复为首发门槛；所有扩展默认不执行支付。</w:t>
+      </w:r>
+    </w:p>
+    <w:p>
+      <w:r>
+        <w:br w:type="page"/>
+      </w:r>
+    </w:p>
+    <w:p>
+      <w:pPr>
+        <w:pStyle w:val="1"/>
+      </w:pPr>
+      <w:r>
+        <w:t>11 工程架构与交付安排</w:t>
+      </w:r>
+    </w:p>
+    <w:p>
+      <w:pPr>
+        <w:pStyle w:val="2"/>
+      </w:pPr>
+      <w:r>
+        <w:t>11 1 当前实现</w:t>
+      </w:r>
+    </w:p>
+    <w:p>
+      <w:r>
+        <w:t>前端采用原生 JavaScript 模块、HTML 与 CSS，Nginx 提供页面并代理 API；后端为 FastAPI，SQLite 保存业务数据、消息、记忆和审计。Docker Compose 启动前后端服务并使用持久卷。当前部署主要面向本地单用户演示。</w:t>
+      </w:r>
+    </w:p>
+    <w:p>
+      <w:r>
+        <w:t>请求流为“界面或聊天 → Agent 规划 → 工具白名单 → 业务计算与校验 → 数据及外部适配器 → 结构化结果与进度事件”。后台任务检查汇率、周期条目、提醒及模拟状态；当前运行于 API 进程内，不是独立高可用调度系统。</w:t>
+      </w:r>
+    </w:p>
+    <w:p>
+      <w:r>
+        <w:t>核心文件包括 agent.py、agent_rules.py、tools.py、memory.py、rates.py、planning.py、expenses.py、money.py、student.py、templates.py、watch.py、mailer.py、motivation.py、service.py 和 api.py。模型与 SMTP 凭据置于服务配置，不由前端持有；银行凭证和私钥不属于本版用户输入需求。</w:t>
+      </w:r>
+    </w:p>
+    <w:p>
+      <w:pPr>
+        <w:pStyle w:val="2"/>
+      </w:pPr>
+      <w:r>
+        <w:t>11 2 分阶段交付</w:t>
+      </w:r>
+    </w:p>
+    <w:p>
+      <w:r>
+        <w:t>阶段 A 为竞赛演示：完成范围术语统一，稳定展示需求澄清、带来源汇率、比较、现金流、模板、记账审核及提醒设置；本地模拟为可选附加演示。使用明确标记的演示资料。</w:t>
+      </w:r>
+    </w:p>
+    <w:p>
+      <w:r>
+        <w:t>阶段 B 为个人试用：优先完成人工实际汇款档案、账单核对、隐私删除、可靠提醒和外部服务验收，观察用户是否理解数据来源与建议局限。</w:t>
+      </w:r>
+    </w:p>
+    <w:p>
+      <w:r>
+        <w:t>阶段 C 为多人服务：在真实用户接入前完成账户隔离、备份恢复、可访问性与负载测试，再评估只读金融数据连接和更多分析能力。</w:t>
+      </w:r>
+    </w:p>
+    <w:p>
+      <w:pPr>
+        <w:pStyle w:val="2"/>
+      </w:pPr>
+      <w:r>
+        <w:t>11 3 新版评估权重</w:t>
+      </w:r>
+    </w:p>
+    <w:p>
+      <w:r>
+        <w:t>需求理解与澄清 15%；汇率来源及解释 20%；方案比较与资金规划 20%；记账和学生财务 15%；模板与人工核对 10%；提醒与记忆 10%；界面、部署和可复核性 10%。总计 100%。</w:t>
+      </w:r>
+    </w:p>
+    <w:p>
+      <w:r>
+        <w:t>这是建议的新版验收权重，不是已经完成的新评分。每项按“实现证据、自动化检查、外部依赖验证、用户可完成任务”评定，待外部验收不得直接算作全部完成。链上执行、AI 自动付款及 AI 支付权限体系不参与评分。</w:t>
+      </w:r>
+    </w:p>
+    <w:p>
+      <w:pPr>
+        <w:pStyle w:val="2"/>
+      </w:pPr>
+      <w:r>
+        <w:t>11 4 文档维护</w:t>
+      </w:r>
+    </w:p>
+    <w:p>
+      <w:r>
+        <w:t>新增功能必须同步修改状态、验收场景及数据边界。单元测试数量需标日期；不以测试全部通过宣称全部需求完成。竞赛展示的独立费用节省、预测精度和用户收益结论应附实际样本及测量方法。</w:t>
+      </w:r>
+    </w:p>
+    <w:p>
+      <w:r>
+        <w:br w:type="page"/>
+      </w:r>
+    </w:p>
+    <w:p>
+      <w:pPr>
+        <w:pStyle w:val="1"/>
+      </w:pPr>
+      <w:r>
+        <w:t>12 竞赛演示与验收清单</w:t>
+      </w:r>
+    </w:p>
+    <w:p>
+      <w:pPr>
+        <w:pStyle w:val="2"/>
+      </w:pPr>
+      <w:r>
+        <w:t>12 1 一条连续演示</w:t>
+      </w:r>
+    </w:p>
+    <w:p>
+      <w:r>
+        <w:t>以“学生月底前需要准备学费，同时希望保留生活费”为例，完成自然语言需求澄清、参考汇率查询、费用情景比较、学期现金流和缺口分析；创建待核实银行模板，并设置汇率与学费提醒。</w:t>
+      </w:r>
+    </w:p>
+    <w:p>
+      <w:r>
+        <w:t>接着导入一份演示账单，确认分类并处理疑似重复，查看消费洞察和计划变化。最后展示记忆笔记、工具过程和审计记录，说明用户需要自行前往银行完成实际支付。模型或行情不可用时，展示有标签的降级或失败状态，不临时编造结果。</w:t>
+      </w:r>
+    </w:p>
+    <w:p>
+      <w:pPr>
+        <w:pStyle w:val="2"/>
+      </w:pPr>
+      <w:r>
+        <w:t>12 2 必验项目</w:t>
+      </w:r>
+    </w:p>
+    <w:p>
+      <w:pPr>
+        <w:spacing w:after="100"/>
+        <w:ind w:left="200" w:hanging="200"/>
+      </w:pPr>
+      <w:r>
+        <w:t>• 范围：演示入口不要求钱包连接、私钥或链上充值，也没有 AI 自动付款和支付授权等级配置。</w:t>
+      </w:r>
+    </w:p>
+    <w:p>
+      <w:pPr>
+        <w:spacing w:after="100"/>
+        <w:ind w:left="200" w:hanging="200"/>
+      </w:pPr>
+      <w:r>
+        <w:t>• 理解：缺少币种、金额或截止日期会追问；跨语言金额与日期可人工核对。</w:t>
+      </w:r>
+    </w:p>
+    <w:p>
+      <w:pPr>
+        <w:spacing w:after="100"/>
+        <w:ind w:left="200" w:hanging="200"/>
+      </w:pPr>
+      <w:r>
+        <w:t>• 行情：来源、时间、方向和数据类型可见；不可用时明确失败；历史窗口及预测假设可检查。</w:t>
+      </w:r>
+    </w:p>
+    <w:p>
+      <w:pPr>
+        <w:spacing w:after="100"/>
+        <w:ind w:left="200" w:hanging="200"/>
+      </w:pPr>
+      <w:r>
+        <w:t>• 计算：净接收额、手续费、目标缺口与安全垫可以复算；预计与已确认资金区分。</w:t>
+      </w:r>
+    </w:p>
+    <w:p>
+      <w:pPr>
+        <w:spacing w:after="100"/>
+        <w:ind w:left="200" w:hanging="200"/>
+      </w:pPr>
+      <w:r>
+        <w:t>• 记账：AI 与导入记录进入审核；重复导入有提示；修改后统计更新。</w:t>
+      </w:r>
+    </w:p>
+    <w:p>
+      <w:pPr>
+        <w:spacing w:after="100"/>
+        <w:ind w:left="200" w:hanging="200"/>
+      </w:pPr>
+      <w:r>
+        <w:t>• 模板：资料变更恢复待核实；账号格式通过不显示为已认证收款人；预览不是银行报文。</w:t>
+      </w:r>
+    </w:p>
+    <w:p>
+      <w:pPr>
+        <w:spacing w:after="100"/>
+        <w:ind w:left="200" w:hanging="200"/>
+      </w:pPr>
+      <w:r>
+        <w:t>• 提醒：可创建和关闭；未配置 SMTP 不显示为已投递；盯盘不触发兑换或付款。</w:t>
+      </w:r>
+    </w:p>
+    <w:p>
+      <w:pPr>
+        <w:spacing w:after="100"/>
+        <w:ind w:left="200" w:hanging="200"/>
+      </w:pPr>
+      <w:r>
+        <w:t>• 记忆：可查看与遗忘；界面说明软遗忘边界；模型不会拿旧记忆覆盖最新账目。</w:t>
+      </w:r>
+    </w:p>
+    <w:p>
+      <w:pPr>
+        <w:spacing w:after="100"/>
+        <w:ind w:left="200" w:hanging="200"/>
+      </w:pPr>
+      <w:r>
+        <w:t>• 可视化：黑白点线圆状态有文字解释；减少动画后仍能完成操作；移动端关键金额可见。</w:t>
+      </w:r>
+    </w:p>
+    <w:p>
+      <w:pPr>
+        <w:spacing w:after="100"/>
+        <w:ind w:left="200" w:hanging="200"/>
+      </w:pPr>
+      <w:r>
+        <w:t>• 演示：本地模拟状态、账本和回执均标注模拟；模拟完成不代表银行到账。</w:t>
+      </w:r>
+    </w:p>
+    <w:p>
+      <w:pPr>
+        <w:spacing w:after="100"/>
+        <w:ind w:left="200" w:hanging="200"/>
+      </w:pPr>
+      <w:r>
+        <w:t>• 工程：Docker 启动、API 健康、持久数据和失败恢复可验证；实际运行版本与验收代码对应。</w:t>
+      </w:r>
+    </w:p>
+    <w:p>
+      <w:pPr>
+        <w:pStyle w:val="2"/>
+      </w:pPr>
+      <w:r>
+        <w:t>12 3 仍待独立验证</w:t>
+      </w:r>
+    </w:p>
+    <w:p>
+      <w:r>
+        <w:t>模型真实工具调用、视觉小票识别、外部行情失败回退、实际 SMTP 投递、六语言浏览器回归和辅助技术体验需要分别验收。现有 163 项 Python 测试提供程序逻辑证据，不证明上述外部路径均已完成。</w:t>
+      </w:r>
+    </w:p>
+    <w:p>
+      <w:pPr>
+        <w:pStyle w:val="2"/>
+      </w:pPr>
+      <w:r>
+        <w:t>12 4 版本变更记录</w:t>
+      </w:r>
+    </w:p>
+    <w:p>
+      <w:r>
+        <w:t>v4.0 以权限控制和服务商沙箱支付为中心。v5.0 改为 NON on-chain 的跨境资金分析与个人财务助手；取消 AI 资金执行需求，保留明确标注的本地模拟，正式纳入新增财务功能，并列出 N01—N11 后续需求。</w:t>
+      </w:r>
+    </w:p>
+    <w:p>
+      <w:r>
+        <w:t>本版成功标准是用户能够理解费用与风险、准备合理计划和准确资料，并自主完成后续银行操作；系统能解释所用数据、保存相关记录并按设置提醒用户。</w:t>
+      </w:r>
+    </w:p>
     <w:sectPr>
+      <w:headerReference w:type="default" r:id="rId9"/>
+      <w:footerReference w:type="default" r:id="rId10"/>
       <w:pgSz w:w="12240" w:h="15840"/>
       <w:pgMar w:top="1440" w:right="1440" w:bottom="1440" w:left="1440" w:header="708" w:footer="708" w:gutter="0"/>
       <w:cols w:space="708"/>
@@ -2278,6 +1370,27 @@
 </w:endnotes>
 </file>
 
+<file path=word/footer1.xml><?xml version="1.0" encoding="utf-8"?>
+<w:ftr xmlns:m="http://schemas.openxmlformats.org/officeDocument/2006/math" xmlns:mc="http://schemas.openxmlformats.org/markup-compatibility/2006" xmlns:mo="http://schemas.microsoft.com/office/mac/office/2008/main" xmlns:mv="urn:schemas-microsoft-com:mac:vml" xmlns:o="urn:schemas-microsoft-com:office:office" xmlns:r="http://schemas.openxmlformats.org/officeDocument/2006/relationships" xmlns:v="urn:schemas-microsoft-com:vml" xmlns:w10="urn:schemas-microsoft-com:office:word" xmlns:w14="http://schemas.microsoft.com/office/word/2010/wordml" xmlns:w="http://schemas.openxmlformats.org/wordprocessingml/2006/main" xmlns:wne="http://schemas.microsoft.com/office/word/2006/wordml" xmlns:wp14="http://schemas.microsoft.com/office/word/2010/wordprocessingDrawing" xmlns:wp="http://schemas.openxmlformats.org/drawingml/2006/wordprocessingDrawing" xmlns:wpc="http://schemas.microsoft.com/office/word/2010/wordprocessingCanvas" xmlns:wpg="http://schemas.microsoft.com/office/word/2010/wordprocessingGroup" xmlns:wpi="http://schemas.microsoft.com/office/word/2010/wordprocessingInk" xmlns:wps="http://schemas.microsoft.com/office/word/2010/wordprocessingShape" mc:Ignorable="w14 wp14">
+  <w:p>
+    <w:pPr>
+      <w:pStyle w:val="Footer"/>
+      <w:jc w:val="center"/>
+    </w:pPr>
+    <w:r>
+      <w:rPr>
+        <w:sz w:val="18"/>
+      </w:rPr>
+    </w:r>
+    <w:fldSimple w:instr="PAGE">
+      <w:r>
+        <w:t>1</w:t>
+      </w:r>
+    </w:fldSimple>
+  </w:p>
+</w:ftr>
+</file>
+
 <file path=word/footnotes.xml><?xml version="1.0" encoding="utf-8"?>
 <w:footnotes xmlns:wpc="http://schemas.microsoft.com/office/word/2010/wordprocessingCanvas" xmlns:cx="http://schemas.microsoft.com/office/drawing/2014/chartex" xmlns:cx1="http://schemas.microsoft.com/office/drawing/2015/9/8/chartex" xmlns:cx2="http://schemas.microsoft.com/office/drawing/2015/10/21/chartex" xmlns:cx3="http://schemas.microsoft.com/office/drawing/2016/5/9/chartex" xmlns:cx4="http://schemas.microsoft.com/office/drawing/2016/5/10/chartex" xmlns:cx5="http://schemas.microsoft.com/office/drawing/2016/5/11/chartex" xmlns:cx6="http://schemas.microsoft.com/office/drawing/2016/5/12/chartex" xmlns:cx7="http://schemas.microsoft.com/office/drawing/2016/5/13/chartex" xmlns:cx8="http://schemas.microsoft.com/office/drawing/2016/5/14/chartex" xmlns:mc="http://schemas.openxmlformats.org/markup-compatibility/2006" xmlns:aink="http://schemas.microsoft.com/office/drawing/2016/ink" xmlns:am3d="http://schemas.microsoft.com/office/drawing/2017/model3d" xmlns:o="urn:schemas-microsoft-com:office:office" xmlns:oel="http://schemas.microsoft.com/office/2019/extlst" xmlns:r="http://schemas.openxmlformats.org/officeDocument/2006/relationships" xmlns:m="http://schemas.openxmlformats.org/officeDocument/2006/math" xmlns:v="urn:schemas-microsoft-com:vml" xmlns:wp14="http://schemas.microsoft.com/office/word/2010/wordprocessingDrawing" xmlns:wp="http://schemas.openxmlformats.org/drawingml/2006/wordprocessingDrawing" xmlns:w10="urn:schemas-microsoft-com:office:word" xmlns:w="http://schemas.openxmlformats.org/wordprocessingml/2006/main" xmlns:w14="http://schemas.microsoft.com/office/word/2010/wordml" xmlns:w15="http://schemas.microsoft.com/office/word/2012/wordml" xmlns:w16cex="http://schemas.microsoft.com/office/word/2018/wordml/cex" xmlns:w16cid="http://schemas.microsoft.com/office/word/2016/wordml/cid" xmlns:w16="http://schemas.microsoft.com/office/word/2018/wordml" xmlns:w16du="http://schemas.microsoft.com/office/word/2023/wordml/word16du" xmlns:w16sdtdh="http://schemas.microsoft.com/office/word/2020/wordml/sdtdatahash" xmlns:w16sdtfl="http://schemas.microsoft.com/office/word/2024/wordml/sdtformatlock" xmlns:w16se="http://schemas.microsoft.com/office/word/2015/wordml/symex" xmlns:wpg="http://schemas.microsoft.com/office/word/2010/wordprocessingGroup" xmlns:wpi="http://schemas.microsoft.com/office/word/2010/wordprocessingInk" xmlns:wne="http://schemas.microsoft.com/office/word/2006/wordml" xmlns:wps="http://schemas.microsoft.com/office/word/2010/wordprocessingShape" mc:Ignorable="w14 w15 w16se w16cid w16 w16cex w16sdtdh w16sdtfl w16du wp14">
   <w:footnote w:type="separator" w:id="-1">
@@ -2301,6 +1414,16 @@
     </w:p>
   </w:footnote>
 </w:footnotes>
+</file>
+
+<file path=word/header1.xml><?xml version="1.0" encoding="utf-8"?>
+<w:hdr xmlns:m="http://schemas.openxmlformats.org/officeDocument/2006/math" xmlns:mc="http://schemas.openxmlformats.org/markup-compatibility/2006" xmlns:mo="http://schemas.microsoft.com/office/mac/office/2008/main" xmlns:mv="urn:schemas-microsoft-com:mac:vml" xmlns:o="urn:schemas-microsoft-com:office:office" xmlns:r="http://schemas.openxmlformats.org/officeDocument/2006/relationships" xmlns:v="urn:schemas-microsoft-com:vml" xmlns:w10="urn:schemas-microsoft-com:office:word" xmlns:w14="http://schemas.microsoft.com/office/word/2010/wordml" xmlns:w="http://schemas.openxmlformats.org/wordprocessingml/2006/main" xmlns:wne="http://schemas.microsoft.com/office/word/2006/wordml" xmlns:wp14="http://schemas.microsoft.com/office/word/2010/wordprocessingDrawing" xmlns:wp="http://schemas.openxmlformats.org/drawingml/2006/wordprocessingDrawing" xmlns:wpc="http://schemas.microsoft.com/office/word/2010/wordprocessingCanvas" xmlns:wpg="http://schemas.microsoft.com/office/word/2010/wordprocessingGroup" xmlns:wpi="http://schemas.microsoft.com/office/word/2010/wordprocessingInk" xmlns:wps="http://schemas.microsoft.com/office/word/2010/wordprocessingShape" mc:Ignorable="w14 wp14">
+  <w:p>
+    <w:pPr>
+      <w:pStyle w:val="Header"/>
+    </w:pPr>
+  </w:p>
+</w:hdr>
 </file>
 
 <file path=word/numbering.xml><?xml version="1.0" encoding="utf-8"?>
@@ -15949,6 +15072,15 @@
   <w:style w:type="paragraph" w:default="1" w:styleId="a">
     <w:name w:val="Normal"/>
     <w:qFormat/>
+    <w:pPr>
+      <w:widowControl/>
+      <w:spacing w:after="120" w:line="276" w:lineRule="auto"/>
+    </w:pPr>
+    <w:rPr>
+      <w:rFonts w:ascii="Calibri" w:hAnsi="Calibri" w:eastAsia="Microsoft YaHei"/>
+      <w:color w:val="000000"/>
+      <w:sz w:val="22"/>
+    </w:rPr>
   </w:style>
   <w:style w:type="paragraph" w:styleId="1">
     <w:name w:val="heading 1"/>
@@ -15961,13 +15093,15 @@
     <w:pPr>
       <w:keepNext/>
       <w:keepLines/>
-      <w:spacing w:before="360" w:after="80"/>
+      <w:widowControl/>
+      <w:spacing w:before="180" w:after="120" w:line="276" w:lineRule="auto"/>
       <w:outlineLvl w:val="0"/>
     </w:pPr>
     <w:rPr>
-      <w:rFonts w:asciiTheme="majorHAnsi" w:eastAsiaTheme="majorEastAsia" w:hAnsiTheme="majorHAnsi" w:cstheme="majorBidi"/>
-      <w:color w:val="0F4761" w:themeColor="accent1" w:themeShade="BF"/>
-      <w:sz w:val="40"/>
+      <w:rFonts w:ascii="Calibri" w:hAnsi="Calibri" w:eastAsia="Microsoft YaHei"/>
+      <w:b/>
+      <w:color w:val="000000"/>
+      <w:sz w:val="34"/>
       <w:szCs w:val="40"/>
     </w:rPr>
   </w:style>
@@ -15984,13 +15118,15 @@
     <w:pPr>
       <w:keepNext/>
       <w:keepLines/>
-      <w:spacing w:before="160" w:after="80"/>
+      <w:widowControl/>
+      <w:spacing w:before="180" w:after="120" w:line="276" w:lineRule="auto"/>
       <w:outlineLvl w:val="1"/>
     </w:pPr>
     <w:rPr>
-      <w:rFonts w:asciiTheme="majorHAnsi" w:eastAsiaTheme="majorEastAsia" w:hAnsiTheme="majorHAnsi" w:cstheme="majorBidi"/>
-      <w:color w:val="0F4761" w:themeColor="accent1" w:themeShade="BF"/>
-      <w:sz w:val="32"/>
+      <w:rFonts w:ascii="Calibri" w:hAnsi="Calibri" w:eastAsia="Microsoft YaHei"/>
+      <w:b/>
+      <w:color w:val="000000"/>
+      <w:sz w:val="24"/>
       <w:szCs w:val="32"/>
     </w:rPr>
   </w:style>
@@ -16303,14 +15439,16 @@
     <w:qFormat/>
     <w:rsid w:val="006A418E"/>
     <w:pPr>
-      <w:spacing w:after="80" w:line="240" w:lineRule="auto"/>
+      <w:widowControl/>
+      <w:spacing w:after="120" w:line="276" w:lineRule="auto"/>
       <w:contextualSpacing/>
     </w:pPr>
     <w:rPr>
-      <w:rFonts w:asciiTheme="majorHAnsi" w:eastAsiaTheme="majorEastAsia" w:hAnsiTheme="majorHAnsi" w:cstheme="majorBidi"/>
+      <w:rFonts w:ascii="Calibri" w:hAnsi="Calibri" w:eastAsia="Microsoft YaHei"/>
+      <w:color w:val="000000"/>
       <w:spacing w:val="-10"/>
       <w:kern w:val="28"/>
-      <w:sz w:val="56"/>
+      <w:sz w:val="48"/>
       <w:szCs w:val="56"/>
     </w:rPr>
   </w:style>
@@ -16337,15 +15475,17 @@
     <w:qFormat/>
     <w:rsid w:val="006A418E"/>
     <w:pPr>
+      <w:widowControl/>
       <w:numPr>
         <w:ilvl w:val="1"/>
       </w:numPr>
+      <w:spacing w:after="120" w:line="276" w:lineRule="auto"/>
     </w:pPr>
     <w:rPr>
-      <w:rFonts w:eastAsiaTheme="majorEastAsia" w:cstheme="majorBidi"/>
-      <w:color w:val="595959" w:themeColor="text1" w:themeTint="A6"/>
+      <w:rFonts w:ascii="Calibri" w:hAnsi="Calibri" w:eastAsia="Microsoft YaHei"/>
+      <w:color w:val="000000"/>
       <w:spacing w:val="15"/>
-      <w:sz w:val="28"/>
+      <w:sz w:val="24"/>
       <w:szCs w:val="28"/>
     </w:rPr>
   </w:style>

</xml_diff>